<commit_message>
fixing bid bug (still bug)
</commit_message>
<xml_diff>
--- a/Process Documents/Test Documents/System Level Testing 1..docx
+++ b/Process Documents/Test Documents/System Level Testing 1..docx
@@ -24,7 +24,7 @@
     <w:p>
       <w:pPr>
         <w:rPr>
-          <w:rFonts w:ascii="Arial" w:hAnsi="Arial" w:cs="Arial" w:hint="eastAsia"/>
+          <w:rFonts w:ascii="Arial" w:hAnsi="Arial" w:cs="Arial"/>
           <w:sz w:val="24"/>
           <w:szCs w:val="24"/>
         </w:rPr>
@@ -404,49 +404,21 @@
               <w:rPr>
                 <w:rFonts w:ascii="Arial" w:eastAsia="Arial" w:hAnsi="Arial" w:cs="Arial"/>
               </w:rPr>
-              <w:t>The game</w:t>
-            </w:r>
-            <w:r>
-              <w:rPr>
-                <w:rFonts w:ascii="Arial" w:eastAsia="Arial" w:hAnsi="Arial" w:cs="Arial"/>
-              </w:rPr>
-              <w:t xml:space="preserve"> should </w:t>
-            </w:r>
+              <w:t xml:space="preserve">The game should </w:t>
+            </w:r>
+            <w:proofErr w:type="spellStart"/>
             <w:r>
               <w:rPr>
                 <w:rFonts w:ascii="Arial" w:eastAsia="Arial" w:hAnsi="Arial" w:cs="Arial"/>
               </w:rPr>
               <w:t>initialise</w:t>
             </w:r>
-            <w:r>
-              <w:rPr>
-                <w:rFonts w:ascii="Arial" w:eastAsia="Arial" w:hAnsi="Arial" w:cs="Arial"/>
-              </w:rPr>
-              <w:t xml:space="preserve"> with correct player money (£1,500 each), board setup, and game pieces,</w:t>
-            </w:r>
-            <w:r>
-              <w:rPr>
-                <w:rFonts w:ascii="Arial" w:eastAsia="Arial" w:hAnsi="Arial" w:cs="Arial"/>
-              </w:rPr>
-              <w:t xml:space="preserve"> </w:t>
-            </w:r>
-            <w:r>
-              <w:rPr>
-                <w:rFonts w:ascii="Arial" w:eastAsia="Arial" w:hAnsi="Arial" w:cs="Arial"/>
-              </w:rPr>
-              <w:t xml:space="preserve">load data from </w:t>
-            </w:r>
-            <w:r>
-              <w:rPr>
-                <w:rFonts w:ascii="Arial" w:eastAsia="Arial" w:hAnsi="Arial" w:cs="Arial"/>
-              </w:rPr>
-              <w:t>an Excel</w:t>
-            </w:r>
-            <w:r>
-              <w:rPr>
-                <w:rFonts w:ascii="Arial" w:eastAsia="Arial" w:hAnsi="Arial" w:cs="Arial"/>
-              </w:rPr>
-              <w:t xml:space="preserve"> file</w:t>
+            <w:proofErr w:type="spellEnd"/>
+            <w:r>
+              <w:rPr>
+                <w:rFonts w:ascii="Arial" w:eastAsia="Arial" w:hAnsi="Arial" w:cs="Arial"/>
+              </w:rPr>
+              <w:t xml:space="preserve"> with correct player money (£1,500 each), board setup, and game pieces, load data from an Excel file</w:t>
             </w:r>
           </w:p>
         </w:tc>
@@ -466,61 +438,21 @@
               <w:rPr>
                 <w:rFonts w:ascii="Arial" w:eastAsia="Arial" w:hAnsi="Arial" w:cs="Arial"/>
               </w:rPr>
-              <w:t>The cmd</w:t>
-            </w:r>
-            <w:r>
-              <w:rPr>
-                <w:rFonts w:ascii="Arial" w:eastAsia="Arial" w:hAnsi="Arial" w:cs="Arial"/>
-              </w:rPr>
-              <w:t xml:space="preserve"> output shows </w:t>
-            </w:r>
-            <w:r>
-              <w:rPr>
-                <w:rFonts w:ascii="Arial" w:eastAsia="Arial" w:hAnsi="Arial" w:cs="Arial"/>
-              </w:rPr>
-              <w:t xml:space="preserve">the </w:t>
-            </w:r>
-            <w:r>
-              <w:rPr>
-                <w:rFonts w:ascii="Arial" w:eastAsia="Arial" w:hAnsi="Arial" w:cs="Arial"/>
-              </w:rPr>
-              <w:t xml:space="preserve">game has been </w:t>
-            </w:r>
-            <w:r>
-              <w:rPr>
-                <w:rFonts w:ascii="Arial" w:eastAsia="Arial" w:hAnsi="Arial" w:cs="Arial"/>
-              </w:rPr>
-              <w:t>Initialized</w:t>
-            </w:r>
-            <w:r>
-              <w:rPr>
-                <w:rFonts w:ascii="Arial" w:eastAsia="Arial" w:hAnsi="Arial" w:cs="Arial"/>
-              </w:rPr>
-              <w:t xml:space="preserve"> </w:t>
-            </w:r>
-            <w:r>
-              <w:rPr>
-                <w:rFonts w:ascii="Arial" w:eastAsia="Arial" w:hAnsi="Arial" w:cs="Arial"/>
-              </w:rPr>
-              <w:t>in</w:t>
-            </w:r>
-            <w:r>
-              <w:rPr>
-                <w:rFonts w:ascii="Arial" w:eastAsia="Arial" w:hAnsi="Arial" w:cs="Arial"/>
-              </w:rPr>
-              <w:t xml:space="preserve"> </w:t>
-            </w:r>
-            <w:r>
-              <w:rPr>
-                <w:rFonts w:ascii="Arial" w:eastAsia="Arial" w:hAnsi="Arial" w:cs="Arial"/>
-              </w:rPr>
-              <w:t xml:space="preserve">the </w:t>
-            </w:r>
-            <w:r>
-              <w:rPr>
-                <w:rFonts w:ascii="Arial" w:eastAsia="Arial" w:hAnsi="Arial" w:cs="Arial"/>
-              </w:rPr>
-              <w:t>correct way</w:t>
+              <w:t xml:space="preserve">The </w:t>
+            </w:r>
+            <w:proofErr w:type="spellStart"/>
+            <w:r>
+              <w:rPr>
+                <w:rFonts w:ascii="Arial" w:eastAsia="Arial" w:hAnsi="Arial" w:cs="Arial"/>
+              </w:rPr>
+              <w:t>cmd</w:t>
+            </w:r>
+            <w:proofErr w:type="spellEnd"/>
+            <w:r>
+              <w:rPr>
+                <w:rFonts w:ascii="Arial" w:eastAsia="Arial" w:hAnsi="Arial" w:cs="Arial"/>
+              </w:rPr>
+              <w:t xml:space="preserve"> output shows the game has been Initialized in the correct way</w:t>
             </w:r>
           </w:p>
         </w:tc>
@@ -635,13 +567,7 @@
               <w:rPr>
                 <w:rFonts w:ascii="Arial" w:eastAsia="Arial" w:hAnsi="Arial" w:cs="Arial"/>
               </w:rPr>
-              <w:t>The test</w:t>
-            </w:r>
-            <w:r>
-              <w:rPr>
-                <w:rFonts w:ascii="Arial" w:eastAsia="Arial" w:hAnsi="Arial" w:cs="Arial"/>
-              </w:rPr>
-              <w:t xml:space="preserve"> bank limit is £50,000</w:t>
+              <w:t>The test bank limit is £50,000</w:t>
             </w:r>
           </w:p>
         </w:tc>
@@ -775,11 +701,19 @@
                 <w:rFonts w:ascii="Arial" w:eastAsia="Arial" w:hAnsi="Arial" w:cs="Arial"/>
               </w:rPr>
             </w:pPr>
-            <w:r>
-              <w:rPr>
-                <w:rFonts w:ascii="Arial" w:eastAsia="Arial" w:hAnsi="Arial" w:cs="Arial"/>
-              </w:rPr>
-              <w:t xml:space="preserve">dice animation is working and </w:t>
+            <w:proofErr w:type="gramStart"/>
+            <w:r>
+              <w:rPr>
+                <w:rFonts w:ascii="Arial" w:eastAsia="Arial" w:hAnsi="Arial" w:cs="Arial"/>
+              </w:rPr>
+              <w:t>dice</w:t>
+            </w:r>
+            <w:proofErr w:type="gramEnd"/>
+            <w:r>
+              <w:rPr>
+                <w:rFonts w:ascii="Arial" w:eastAsia="Arial" w:hAnsi="Arial" w:cs="Arial"/>
+              </w:rPr>
+              <w:t xml:space="preserve"> animation is working and </w:t>
             </w:r>
             <w:r>
               <w:rPr>
@@ -1018,13 +952,7 @@
               <w:rPr>
                 <w:rFonts w:ascii="Arial" w:eastAsia="Arial" w:hAnsi="Arial" w:cs="Arial"/>
               </w:rPr>
-              <w:t>The player</w:t>
-            </w:r>
-            <w:r>
-              <w:rPr>
-                <w:rFonts w:ascii="Arial" w:eastAsia="Arial" w:hAnsi="Arial" w:cs="Arial"/>
-              </w:rPr>
-              <w:t xml:space="preserve"> should receive £200, lap counter should increment</w:t>
+              <w:t>The player should receive £200, lap counter should increment</w:t>
             </w:r>
           </w:p>
         </w:tc>
@@ -1044,49 +972,21 @@
               <w:rPr>
                 <w:rFonts w:ascii="Arial" w:eastAsia="Arial" w:hAnsi="Arial" w:cs="Arial"/>
               </w:rPr>
-              <w:t>The player</w:t>
-            </w:r>
-            <w:r>
-              <w:rPr>
-                <w:rFonts w:ascii="Arial" w:eastAsia="Arial" w:hAnsi="Arial" w:cs="Arial"/>
-              </w:rPr>
-              <w:t xml:space="preserve"> should receive £200,</w:t>
-            </w:r>
-            <w:r>
-              <w:rPr>
-                <w:rFonts w:ascii="Arial" w:eastAsia="Arial" w:hAnsi="Arial" w:cs="Arial"/>
-              </w:rPr>
-              <w:t xml:space="preserve"> </w:t>
-            </w:r>
-            <w:r>
-              <w:rPr>
-                <w:rFonts w:ascii="Arial" w:eastAsia="Arial" w:hAnsi="Arial" w:cs="Arial"/>
-              </w:rPr>
-              <w:t xml:space="preserve">and </w:t>
-            </w:r>
-            <w:r>
-              <w:rPr>
-                <w:rFonts w:ascii="Arial" w:eastAsia="Arial" w:hAnsi="Arial" w:cs="Arial"/>
-              </w:rPr>
-              <w:t xml:space="preserve">be </w:t>
-            </w:r>
-            <w:r>
-              <w:rPr>
-                <w:rFonts w:ascii="Arial" w:eastAsia="Arial" w:hAnsi="Arial" w:cs="Arial"/>
-              </w:rPr>
-              <w:t xml:space="preserve">able to buy </w:t>
-            </w:r>
-            <w:r>
-              <w:rPr>
-                <w:rFonts w:ascii="Arial" w:eastAsia="Arial" w:hAnsi="Arial" w:cs="Arial"/>
-              </w:rPr>
-              <w:t xml:space="preserve">the </w:t>
-            </w:r>
-            <w:r>
-              <w:rPr>
-                <w:rFonts w:ascii="Arial" w:eastAsia="Arial" w:hAnsi="Arial" w:cs="Arial"/>
-              </w:rPr>
-              <w:t>property  after passing go on the first time</w:t>
+              <w:t xml:space="preserve">The player should receive £200, and be able to buy the </w:t>
+            </w:r>
+            <w:proofErr w:type="gramStart"/>
+            <w:r>
+              <w:rPr>
+                <w:rFonts w:ascii="Arial" w:eastAsia="Arial" w:hAnsi="Arial" w:cs="Arial"/>
+              </w:rPr>
+              <w:t>property  after</w:t>
+            </w:r>
+            <w:proofErr w:type="gramEnd"/>
+            <w:r>
+              <w:rPr>
+                <w:rFonts w:ascii="Arial" w:eastAsia="Arial" w:hAnsi="Arial" w:cs="Arial"/>
+              </w:rPr>
+              <w:t xml:space="preserve"> passing go on the first time</w:t>
             </w:r>
           </w:p>
         </w:tc>
@@ -1337,8 +1237,16 @@
               <w:rPr>
                 <w:rFonts w:ascii="Arial" w:eastAsia="Arial" w:hAnsi="Arial" w:cs="Arial"/>
               </w:rPr>
-              <w:t>a colour</w:t>
-            </w:r>
+              <w:t xml:space="preserve">a </w:t>
+            </w:r>
+            <w:proofErr w:type="spellStart"/>
+            <w:r>
+              <w:rPr>
+                <w:rFonts w:ascii="Arial" w:eastAsia="Arial" w:hAnsi="Arial" w:cs="Arial"/>
+              </w:rPr>
+              <w:t>colour</w:t>
+            </w:r>
+            <w:proofErr w:type="spellEnd"/>
             <w:r>
               <w:rPr>
                 <w:rFonts w:ascii="Arial" w:eastAsia="Arial" w:hAnsi="Arial" w:cs="Arial"/>
@@ -1728,6 +1636,7 @@
               <w:rPr>
                 <w:rFonts w:ascii="Arial" w:eastAsia="Arial" w:hAnsi="Arial" w:cs="Arial"/>
               </w:rPr>
+              <w:lastRenderedPageBreak/>
               <w:t>6</w:t>
             </w:r>
           </w:p>
@@ -1788,25 +1697,7 @@
               <w:rPr>
                 <w:rFonts w:ascii="Arial" w:eastAsia="Arial" w:hAnsi="Arial" w:cs="Arial"/>
               </w:rPr>
-              <w:t>An auction</w:t>
-            </w:r>
-            <w:r>
-              <w:rPr>
-                <w:rFonts w:ascii="Arial" w:eastAsia="Arial" w:hAnsi="Arial" w:cs="Arial"/>
-              </w:rPr>
-              <w:t xml:space="preserve"> interface should appear, </w:t>
-            </w:r>
-            <w:r>
-              <w:rPr>
-                <w:rFonts w:ascii="Arial" w:eastAsia="Arial" w:hAnsi="Arial" w:cs="Arial"/>
-              </w:rPr>
-              <w:t xml:space="preserve">and </w:t>
-            </w:r>
-            <w:r>
-              <w:rPr>
-                <w:rFonts w:ascii="Arial" w:eastAsia="Arial" w:hAnsi="Arial" w:cs="Arial"/>
-              </w:rPr>
-              <w:t>all players should be able to bid</w:t>
+              <w:t>An auction interface should appear, and all players should be able to bid</w:t>
             </w:r>
           </w:p>
         </w:tc>
@@ -1878,6 +1769,60 @@
                 <w:rFonts w:ascii="Arial" w:eastAsia="Arial" w:hAnsi="Arial" w:cs="Arial"/>
               </w:rPr>
             </w:pPr>
+            <w:r>
+              <w:rPr>
+                <w:rFonts w:ascii="Arial" w:eastAsia="Arial" w:hAnsi="Arial" w:cs="Arial"/>
+                <w:noProof/>
+              </w:rPr>
+              <w:drawing>
+                <wp:inline distT="0" distB="0" distL="0" distR="0" wp14:anchorId="082D06BC" wp14:editId="6792D7FB">
+                  <wp:extent cx="2186940" cy="1783080"/>
+                  <wp:effectExtent l="0" t="0" r="3810" b="7620"/>
+                  <wp:docPr id="82837514" name="圖片 1"/>
+                  <wp:cNvGraphicFramePr>
+                    <a:graphicFrameLocks xmlns:a="http://schemas.openxmlformats.org/drawingml/2006/main" noChangeAspect="1"/>
+                  </wp:cNvGraphicFramePr>
+                  <a:graphic xmlns:a="http://schemas.openxmlformats.org/drawingml/2006/main">
+                    <a:graphicData uri="http://schemas.openxmlformats.org/drawingml/2006/picture">
+                      <pic:pic xmlns:pic="http://schemas.openxmlformats.org/drawingml/2006/picture">
+                        <pic:nvPicPr>
+                          <pic:cNvPr id="0" name="Picture 1"/>
+                          <pic:cNvPicPr>
+                            <a:picLocks noChangeAspect="1" noChangeArrowheads="1"/>
+                          </pic:cNvPicPr>
+                        </pic:nvPicPr>
+                        <pic:blipFill>
+                          <a:blip r:embed="rId10" cstate="print">
+                            <a:extLst>
+                              <a:ext uri="{28A0092B-C50C-407E-A947-70E740481C1C}">
+                                <a14:useLocalDpi xmlns:a14="http://schemas.microsoft.com/office/drawing/2010/main" val="0"/>
+                              </a:ext>
+                            </a:extLst>
+                          </a:blip>
+                          <a:srcRect/>
+                          <a:stretch>
+                            <a:fillRect/>
+                          </a:stretch>
+                        </pic:blipFill>
+                        <pic:spPr bwMode="auto">
+                          <a:xfrm>
+                            <a:off x="0" y="0"/>
+                            <a:ext cx="2186940" cy="1783080"/>
+                          </a:xfrm>
+                          <a:prstGeom prst="rect">
+                            <a:avLst/>
+                          </a:prstGeom>
+                          <a:noFill/>
+                          <a:ln>
+                            <a:noFill/>
+                          </a:ln>
+                        </pic:spPr>
+                      </pic:pic>
+                    </a:graphicData>
+                  </a:graphic>
+                </wp:inline>
+              </w:drawing>
+            </w:r>
           </w:p>
         </w:tc>
         <w:tc>
@@ -1964,7 +1909,6 @@
               <w:rPr>
                 <w:rFonts w:ascii="Arial" w:eastAsia="Arial" w:hAnsi="Arial" w:cs="Arial"/>
               </w:rPr>
-              <w:lastRenderedPageBreak/>
               <w:t>7</w:t>
             </w:r>
           </w:p>
@@ -2005,7 +1949,21 @@
               <w:rPr>
                 <w:rFonts w:ascii="Arial" w:eastAsia="Arial" w:hAnsi="Arial" w:cs="Arial"/>
               </w:rPr>
-              <w:t>Land on "Pot Luck" or "Opportunity Knocks" spaces</w:t>
+              <w:t>Land on "</w:t>
+            </w:r>
+            <w:proofErr w:type="gramStart"/>
+            <w:r>
+              <w:rPr>
+                <w:rFonts w:ascii="Arial" w:eastAsia="Arial" w:hAnsi="Arial" w:cs="Arial"/>
+              </w:rPr>
+              <w:t>Pot Luck</w:t>
+            </w:r>
+            <w:proofErr w:type="gramEnd"/>
+            <w:r>
+              <w:rPr>
+                <w:rFonts w:ascii="Arial" w:eastAsia="Arial" w:hAnsi="Arial" w:cs="Arial"/>
+              </w:rPr>
+              <w:t>" or "Opportunity Knocks" spaces</w:t>
             </w:r>
           </w:p>
         </w:tc>
@@ -2074,7 +2032,7 @@
                           <pic:cNvPicPr preferRelativeResize="0"/>
                         </pic:nvPicPr>
                         <pic:blipFill>
-                          <a:blip r:embed="rId10"/>
+                          <a:blip r:embed="rId11"/>
                           <a:srcRect/>
                           <a:stretch>
                             <a:fillRect/>
@@ -2134,13 +2092,7 @@
               <w:rPr>
                 <w:rFonts w:ascii="Arial" w:eastAsia="Arial" w:hAnsi="Arial" w:cs="Arial"/>
               </w:rPr>
-              <w:t xml:space="preserve">the </w:t>
-            </w:r>
-            <w:r>
-              <w:rPr>
-                <w:rFonts w:ascii="Arial" w:eastAsia="Arial" w:hAnsi="Arial" w:cs="Arial"/>
-              </w:rPr>
-              <w:t>problem should be in</w:t>
+              <w:t>the problem should be in</w:t>
             </w:r>
           </w:p>
         </w:tc>
@@ -2242,13 +2194,7 @@
               <w:rPr>
                 <w:rFonts w:ascii="Arial" w:eastAsia="Arial" w:hAnsi="Arial" w:cs="Arial"/>
               </w:rPr>
-              <w:t>The player</w:t>
-            </w:r>
-            <w:r>
-              <w:rPr>
-                <w:rFonts w:ascii="Arial" w:eastAsia="Arial" w:hAnsi="Arial" w:cs="Arial"/>
-              </w:rPr>
-              <w:t xml:space="preserve"> should move to jail, miss turns until conditions met</w:t>
+              <w:t>The player should move to jail, miss turns until conditions met</w:t>
             </w:r>
           </w:p>
         </w:tc>
@@ -2280,7 +2226,21 @@
               <w:rPr>
                 <w:rFonts w:ascii="Arial" w:eastAsia="Arial" w:hAnsi="Arial" w:cs="Arial"/>
               </w:rPr>
-              <w:t>player position move to jail</w:t>
+              <w:t xml:space="preserve">player position </w:t>
+            </w:r>
+            <w:proofErr w:type="gramStart"/>
+            <w:r>
+              <w:rPr>
+                <w:rFonts w:ascii="Arial" w:eastAsia="Arial" w:hAnsi="Arial" w:cs="Arial"/>
+              </w:rPr>
+              <w:t>move</w:t>
+            </w:r>
+            <w:proofErr w:type="gramEnd"/>
+            <w:r>
+              <w:rPr>
+                <w:rFonts w:ascii="Arial" w:eastAsia="Arial" w:hAnsi="Arial" w:cs="Arial"/>
+              </w:rPr>
+              <w:t xml:space="preserve"> to jail</w:t>
             </w:r>
           </w:p>
         </w:tc>
@@ -2319,7 +2279,7 @@
                           </pic:cNvPicPr>
                         </pic:nvPicPr>
                         <pic:blipFill>
-                          <a:blip r:embed="rId11">
+                          <a:blip r:embed="rId12">
                             <a:extLst>
                               <a:ext uri="{28A0092B-C50C-407E-A947-70E740481C1C}">
                                 <a14:useLocalDpi xmlns:a14="http://schemas.microsoft.com/office/drawing/2010/main" val="0"/>
@@ -2490,37 +2450,7 @@
               <w:rPr>
                 <w:rFonts w:ascii="Arial" w:eastAsia="Arial" w:hAnsi="Arial" w:cs="Arial"/>
               </w:rPr>
-              <w:t>The player</w:t>
-            </w:r>
-            <w:r>
-              <w:rPr>
-                <w:rFonts w:ascii="Arial" w:eastAsia="Arial" w:hAnsi="Arial" w:cs="Arial"/>
-              </w:rPr>
-              <w:t xml:space="preserve"> should collect accumulated fine money (if </w:t>
-            </w:r>
-            <w:r>
-              <w:rPr>
-                <w:rFonts w:ascii="Arial" w:eastAsia="Arial" w:hAnsi="Arial" w:cs="Arial"/>
-              </w:rPr>
-              <w:t xml:space="preserve">the </w:t>
-            </w:r>
-            <w:r>
-              <w:rPr>
-                <w:rFonts w:ascii="Arial" w:eastAsia="Arial" w:hAnsi="Arial" w:cs="Arial"/>
-              </w:rPr>
-              <w:t xml:space="preserve">house rule </w:t>
-            </w:r>
-            <w:r>
-              <w:rPr>
-                <w:rFonts w:ascii="Arial" w:eastAsia="Arial" w:hAnsi="Arial" w:cs="Arial"/>
-              </w:rPr>
-              <w:t xml:space="preserve">is </w:t>
-            </w:r>
-            <w:r>
-              <w:rPr>
-                <w:rFonts w:ascii="Arial" w:eastAsia="Arial" w:hAnsi="Arial" w:cs="Arial"/>
-              </w:rPr>
-              <w:t>enabled)</w:t>
+              <w:t>The player should collect accumulated fine money (if the house rule is enabled)</w:t>
             </w:r>
           </w:p>
         </w:tc>
@@ -2617,7 +2547,7 @@
                           <pic:cNvPicPr preferRelativeResize="0"/>
                         </pic:nvPicPr>
                         <pic:blipFill>
-                          <a:blip r:embed="rId12"/>
+                          <a:blip r:embed="rId13"/>
                           <a:srcRect/>
                           <a:stretch>
                             <a:fillRect/>
@@ -2682,7 +2612,7 @@
                           </pic:cNvPicPr>
                         </pic:nvPicPr>
                         <pic:blipFill>
-                          <a:blip r:embed="rId13" cstate="print">
+                          <a:blip r:embed="rId14" cstate="print">
                             <a:extLst>
                               <a:ext uri="{28A0092B-C50C-407E-A947-70E740481C1C}">
                                 <a14:useLocalDpi xmlns:a14="http://schemas.microsoft.com/office/drawing/2010/main" val="0"/>
@@ -2779,6 +2709,7 @@
               <w:rPr>
                 <w:rFonts w:ascii="Arial" w:eastAsia="Arial" w:hAnsi="Arial" w:cs="Arial"/>
               </w:rPr>
+              <w:lastRenderedPageBreak/>
               <w:t>10</w:t>
             </w:r>
           </w:p>
@@ -2871,7 +2802,21 @@
               <w:rPr>
                 <w:rFonts w:ascii="Arial" w:eastAsia="Arial" w:hAnsi="Arial" w:cs="Arial"/>
               </w:rPr>
-              <w:t>House added and showed on ui and the board</w:t>
+              <w:t xml:space="preserve">House added and showed on </w:t>
+            </w:r>
+            <w:proofErr w:type="spellStart"/>
+            <w:r>
+              <w:rPr>
+                <w:rFonts w:ascii="Arial" w:eastAsia="Arial" w:hAnsi="Arial" w:cs="Arial"/>
+              </w:rPr>
+              <w:t>ui</w:t>
+            </w:r>
+            <w:proofErr w:type="spellEnd"/>
+            <w:r>
+              <w:rPr>
+                <w:rFonts w:ascii="Arial" w:eastAsia="Arial" w:hAnsi="Arial" w:cs="Arial"/>
+              </w:rPr>
+              <w:t xml:space="preserve"> and the board</w:t>
             </w:r>
           </w:p>
         </w:tc>
@@ -2906,7 +2851,7 @@
                           <pic:cNvPicPr preferRelativeResize="0"/>
                         </pic:nvPicPr>
                         <pic:blipFill>
-                          <a:blip r:embed="rId14"/>
+                          <a:blip r:embed="rId15"/>
                           <a:srcRect/>
                           <a:stretch>
                             <a:fillRect/>
@@ -3092,37 +3037,7 @@
               <w:rPr>
                 <w:rFonts w:ascii="Arial" w:eastAsia="Arial" w:hAnsi="Arial" w:cs="Arial"/>
               </w:rPr>
-              <w:t>The player</w:t>
-            </w:r>
-            <w:r>
-              <w:rPr>
-                <w:rFonts w:ascii="Arial" w:eastAsia="Arial" w:hAnsi="Arial" w:cs="Arial"/>
-              </w:rPr>
-              <w:t xml:space="preserve"> should go bankrupt, </w:t>
-            </w:r>
-            <w:r>
-              <w:rPr>
-                <w:rFonts w:ascii="Arial" w:eastAsia="Arial" w:hAnsi="Arial" w:cs="Arial"/>
-              </w:rPr>
-              <w:t xml:space="preserve">and </w:t>
-            </w:r>
-            <w:r>
-              <w:rPr>
-                <w:rFonts w:ascii="Arial" w:eastAsia="Arial" w:hAnsi="Arial" w:cs="Arial"/>
-              </w:rPr>
-              <w:t xml:space="preserve">assets transferred to </w:t>
-            </w:r>
-            <w:r>
-              <w:rPr>
-                <w:rFonts w:ascii="Arial" w:eastAsia="Arial" w:hAnsi="Arial" w:cs="Arial"/>
-              </w:rPr>
-              <w:t xml:space="preserve">the </w:t>
-            </w:r>
-            <w:r>
-              <w:rPr>
-                <w:rFonts w:ascii="Arial" w:eastAsia="Arial" w:hAnsi="Arial" w:cs="Arial"/>
-              </w:rPr>
-              <w:t>bank</w:t>
+              <w:t>The player should go bankrupt, and assets transferred to the bank</w:t>
             </w:r>
           </w:p>
         </w:tc>
@@ -3138,29 +3053,19 @@
                 <w:rFonts w:ascii="Arial" w:eastAsia="Arial" w:hAnsi="Arial" w:cs="Arial"/>
               </w:rPr>
             </w:pPr>
-            <w:r>
-              <w:rPr>
-                <w:rFonts w:ascii="Arial" w:eastAsia="Arial" w:hAnsi="Arial" w:cs="Arial"/>
-              </w:rPr>
-              <w:t xml:space="preserve">the </w:t>
-            </w:r>
-            <w:r>
-              <w:rPr>
-                <w:rFonts w:ascii="Arial" w:eastAsia="Arial" w:hAnsi="Arial" w:cs="Arial"/>
-              </w:rPr>
-              <w:t xml:space="preserve">player </w:t>
-            </w:r>
-            <w:r>
-              <w:rPr>
-                <w:rFonts w:ascii="Arial" w:eastAsia="Arial" w:hAnsi="Arial" w:cs="Arial"/>
-              </w:rPr>
-              <w:t xml:space="preserve">was </w:t>
-            </w:r>
-            <w:r>
-              <w:rPr>
-                <w:rFonts w:ascii="Arial" w:eastAsia="Arial" w:hAnsi="Arial" w:cs="Arial"/>
-              </w:rPr>
-              <w:t>marked as bankrupt</w:t>
+            <w:proofErr w:type="gramStart"/>
+            <w:r>
+              <w:rPr>
+                <w:rFonts w:ascii="Arial" w:eastAsia="Arial" w:hAnsi="Arial" w:cs="Arial"/>
+              </w:rPr>
+              <w:t>the</w:t>
+            </w:r>
+            <w:proofErr w:type="gramEnd"/>
+            <w:r>
+              <w:rPr>
+                <w:rFonts w:ascii="Arial" w:eastAsia="Arial" w:hAnsi="Arial" w:cs="Arial"/>
+              </w:rPr>
+              <w:t xml:space="preserve"> player was marked as bankrupt</w:t>
             </w:r>
           </w:p>
         </w:tc>
@@ -3256,7 +3161,6 @@
               <w:rPr>
                 <w:rFonts w:ascii="Arial" w:eastAsia="Arial" w:hAnsi="Arial" w:cs="Arial"/>
               </w:rPr>
-              <w:lastRenderedPageBreak/>
               <w:t>12</w:t>
             </w:r>
           </w:p>
@@ -3396,7 +3300,7 @@
                           <pic:cNvPicPr preferRelativeResize="0"/>
                         </pic:nvPicPr>
                         <pic:blipFill>
-                          <a:blip r:embed="rId15"/>
+                          <a:blip r:embed="rId16"/>
                           <a:srcRect/>
                           <a:stretch>
                             <a:fillRect/>
@@ -3476,13 +3380,7 @@
               <w:rPr>
                 <w:rFonts w:ascii="Arial" w:eastAsia="Arial" w:hAnsi="Arial" w:cs="Arial"/>
               </w:rPr>
-              <w:t>Tests are</w:t>
-            </w:r>
-            <w:r>
-              <w:rPr>
-                <w:rFonts w:ascii="Arial" w:eastAsia="Arial" w:hAnsi="Arial" w:cs="Arial"/>
-              </w:rPr>
-              <w:t xml:space="preserve"> both easy and hard difficulty</w:t>
+              <w:t>Tests are both easy and hard difficulty</w:t>
             </w:r>
           </w:p>
         </w:tc>
@@ -3564,13 +3462,7 @@
               <w:rPr>
                 <w:rFonts w:ascii="Arial" w:eastAsia="Arial" w:hAnsi="Arial" w:cs="Arial"/>
               </w:rPr>
-              <w:t>The game</w:t>
-            </w:r>
-            <w:r>
-              <w:rPr>
-                <w:rFonts w:ascii="Arial" w:eastAsia="Arial" w:hAnsi="Arial" w:cs="Arial"/>
-              </w:rPr>
-              <w:t xml:space="preserve"> should end and declare winner</w:t>
+              <w:t>The game should end and declare winner</w:t>
             </w:r>
           </w:p>
         </w:tc>
@@ -3625,7 +3517,7 @@
                           <pic:cNvPicPr preferRelativeResize="0"/>
                         </pic:nvPicPr>
                         <pic:blipFill>
-                          <a:blip r:embed="rId16"/>
+                          <a:blip r:embed="rId17"/>
                           <a:srcRect/>
                           <a:stretch>
                             <a:fillRect/>
@@ -3846,7 +3738,7 @@
                           </pic:cNvPicPr>
                         </pic:nvPicPr>
                         <pic:blipFill>
-                          <a:blip r:embed="rId17" cstate="print">
+                          <a:blip r:embed="rId18" cstate="print">
                             <a:extLst>
                               <a:ext uri="{28A0092B-C50C-407E-A947-70E740481C1C}">
                                 <a14:useLocalDpi xmlns:a14="http://schemas.microsoft.com/office/drawing/2010/main" val="0"/>

</xml_diff>

<commit_message>
Fix : problem and upload level testing 1
Fix : problem and upload level testing 1
</commit_message>
<xml_diff>
--- a/Process Documents/Test Documents/System Level Testing 1..docx
+++ b/Process Documents/Test Documents/System Level Testing 1..docx
@@ -114,15 +114,15 @@
         <w:tblLook w:val="0400" w:firstRow="0" w:lastRow="0" w:firstColumn="0" w:lastColumn="0" w:noHBand="0" w:noVBand="1"/>
       </w:tblPr>
       <w:tblGrid>
-        <w:gridCol w:w="675"/>
-        <w:gridCol w:w="1065"/>
-        <w:gridCol w:w="1935"/>
-        <w:gridCol w:w="1950"/>
-        <w:gridCol w:w="1650"/>
-        <w:gridCol w:w="3630"/>
-        <w:gridCol w:w="1200"/>
-        <w:gridCol w:w="1725"/>
-        <w:gridCol w:w="1590"/>
+        <w:gridCol w:w="562"/>
+        <w:gridCol w:w="1418"/>
+        <w:gridCol w:w="1695"/>
+        <w:gridCol w:w="2132"/>
+        <w:gridCol w:w="2268"/>
+        <w:gridCol w:w="3827"/>
+        <w:gridCol w:w="709"/>
+        <w:gridCol w:w="1559"/>
+        <w:gridCol w:w="1250"/>
       </w:tblGrid>
       <w:tr>
         <w:trPr>
@@ -130,7 +130,7 @@
         </w:trPr>
         <w:tc>
           <w:tcPr>
-            <w:tcW w:w="675" w:type="dxa"/>
+            <w:tcW w:w="562" w:type="dxa"/>
             <w:shd w:val="clear" w:color="auto" w:fill="auto"/>
             <w:vAlign w:val="center"/>
           </w:tcPr>
@@ -152,7 +152,7 @@
         </w:tc>
         <w:tc>
           <w:tcPr>
-            <w:tcW w:w="1065" w:type="dxa"/>
+            <w:tcW w:w="1418" w:type="dxa"/>
             <w:shd w:val="clear" w:color="auto" w:fill="auto"/>
             <w:vAlign w:val="center"/>
           </w:tcPr>
@@ -174,7 +174,7 @@
         </w:tc>
         <w:tc>
           <w:tcPr>
-            <w:tcW w:w="1935" w:type="dxa"/>
+            <w:tcW w:w="1695" w:type="dxa"/>
             <w:shd w:val="clear" w:color="auto" w:fill="auto"/>
             <w:vAlign w:val="center"/>
           </w:tcPr>
@@ -196,7 +196,7 @@
         </w:tc>
         <w:tc>
           <w:tcPr>
-            <w:tcW w:w="1950" w:type="dxa"/>
+            <w:tcW w:w="2132" w:type="dxa"/>
             <w:shd w:val="clear" w:color="auto" w:fill="auto"/>
             <w:vAlign w:val="center"/>
           </w:tcPr>
@@ -218,7 +218,7 @@
         </w:tc>
         <w:tc>
           <w:tcPr>
-            <w:tcW w:w="1650" w:type="dxa"/>
+            <w:tcW w:w="2268" w:type="dxa"/>
             <w:shd w:val="clear" w:color="auto" w:fill="auto"/>
             <w:vAlign w:val="center"/>
           </w:tcPr>
@@ -240,7 +240,7 @@
         </w:tc>
         <w:tc>
           <w:tcPr>
-            <w:tcW w:w="3630" w:type="dxa"/>
+            <w:tcW w:w="3827" w:type="dxa"/>
             <w:shd w:val="clear" w:color="auto" w:fill="auto"/>
             <w:vAlign w:val="center"/>
           </w:tcPr>
@@ -262,7 +262,7 @@
         </w:tc>
         <w:tc>
           <w:tcPr>
-            <w:tcW w:w="1200" w:type="dxa"/>
+            <w:tcW w:w="709" w:type="dxa"/>
             <w:shd w:val="clear" w:color="auto" w:fill="auto"/>
             <w:vAlign w:val="center"/>
           </w:tcPr>
@@ -284,7 +284,7 @@
         </w:tc>
         <w:tc>
           <w:tcPr>
-            <w:tcW w:w="1725" w:type="dxa"/>
+            <w:tcW w:w="1559" w:type="dxa"/>
             <w:shd w:val="clear" w:color="auto" w:fill="auto"/>
             <w:vAlign w:val="center"/>
           </w:tcPr>
@@ -306,7 +306,7 @@
         </w:tc>
         <w:tc>
           <w:tcPr>
-            <w:tcW w:w="1590" w:type="dxa"/>
+            <w:tcW w:w="1250" w:type="dxa"/>
             <w:shd w:val="clear" w:color="auto" w:fill="auto"/>
             <w:vAlign w:val="center"/>
           </w:tcPr>
@@ -330,7 +330,7 @@
       <w:tr>
         <w:tc>
           <w:tcPr>
-            <w:tcW w:w="675" w:type="dxa"/>
+            <w:tcW w:w="562" w:type="dxa"/>
             <w:shd w:val="clear" w:color="auto" w:fill="auto"/>
             <w:vAlign w:val="center"/>
           </w:tcPr>
@@ -350,7 +350,7 @@
         </w:tc>
         <w:tc>
           <w:tcPr>
-            <w:tcW w:w="1065" w:type="dxa"/>
+            <w:tcW w:w="1418" w:type="dxa"/>
             <w:shd w:val="clear" w:color="auto" w:fill="auto"/>
             <w:vAlign w:val="center"/>
           </w:tcPr>
@@ -370,7 +370,7 @@
         </w:tc>
         <w:tc>
           <w:tcPr>
-            <w:tcW w:w="1935" w:type="dxa"/>
+            <w:tcW w:w="1695" w:type="dxa"/>
             <w:shd w:val="clear" w:color="auto" w:fill="auto"/>
             <w:vAlign w:val="center"/>
           </w:tcPr>
@@ -390,7 +390,7 @@
         </w:tc>
         <w:tc>
           <w:tcPr>
-            <w:tcW w:w="1950" w:type="dxa"/>
+            <w:tcW w:w="2132" w:type="dxa"/>
             <w:shd w:val="clear" w:color="auto" w:fill="auto"/>
             <w:vAlign w:val="center"/>
           </w:tcPr>
@@ -424,7 +424,7 @@
         </w:tc>
         <w:tc>
           <w:tcPr>
-            <w:tcW w:w="1650" w:type="dxa"/>
+            <w:tcW w:w="2268" w:type="dxa"/>
             <w:shd w:val="clear" w:color="auto" w:fill="auto"/>
             <w:vAlign w:val="center"/>
           </w:tcPr>
@@ -458,7 +458,7 @@
         </w:tc>
         <w:tc>
           <w:tcPr>
-            <w:tcW w:w="3630" w:type="dxa"/>
+            <w:tcW w:w="3827" w:type="dxa"/>
             <w:shd w:val="clear" w:color="auto" w:fill="auto"/>
             <w:vAlign w:val="center"/>
           </w:tcPr>
@@ -487,7 +487,7 @@
                           <pic:cNvPicPr preferRelativeResize="0"/>
                         </pic:nvPicPr>
                         <pic:blipFill>
-                          <a:blip r:embed="rId5"/>
+                          <a:blip r:embed="rId7"/>
                           <a:srcRect/>
                           <a:stretch>
                             <a:fillRect/>
@@ -513,8 +513,8 @@
         </w:tc>
         <w:tc>
           <w:tcPr>
-            <w:tcW w:w="1200" w:type="dxa"/>
-            <w:shd w:val="clear" w:color="auto" w:fill="auto"/>
+            <w:tcW w:w="709" w:type="dxa"/>
+            <w:shd w:val="clear" w:color="auto" w:fill="E2EFD9" w:themeFill="accent6" w:themeFillTint="33"/>
             <w:vAlign w:val="center"/>
           </w:tcPr>
           <w:p>
@@ -533,7 +533,7 @@
         </w:tc>
         <w:tc>
           <w:tcPr>
-            <w:tcW w:w="1725" w:type="dxa"/>
+            <w:tcW w:w="1559" w:type="dxa"/>
             <w:shd w:val="clear" w:color="auto" w:fill="auto"/>
             <w:vAlign w:val="center"/>
           </w:tcPr>
@@ -553,7 +553,7 @@
         </w:tc>
         <w:tc>
           <w:tcPr>
-            <w:tcW w:w="1590" w:type="dxa"/>
+            <w:tcW w:w="1250" w:type="dxa"/>
             <w:shd w:val="clear" w:color="auto" w:fill="auto"/>
             <w:vAlign w:val="center"/>
           </w:tcPr>
@@ -575,7 +575,7 @@
       <w:tr>
         <w:tc>
           <w:tcPr>
-            <w:tcW w:w="675" w:type="dxa"/>
+            <w:tcW w:w="562" w:type="dxa"/>
             <w:shd w:val="clear" w:color="auto" w:fill="auto"/>
             <w:vAlign w:val="center"/>
           </w:tcPr>
@@ -595,7 +595,7 @@
         </w:tc>
         <w:tc>
           <w:tcPr>
-            <w:tcW w:w="1065" w:type="dxa"/>
+            <w:tcW w:w="1418" w:type="dxa"/>
             <w:shd w:val="clear" w:color="auto" w:fill="auto"/>
             <w:vAlign w:val="center"/>
           </w:tcPr>
@@ -615,7 +615,7 @@
         </w:tc>
         <w:tc>
           <w:tcPr>
-            <w:tcW w:w="1935" w:type="dxa"/>
+            <w:tcW w:w="1695" w:type="dxa"/>
             <w:shd w:val="clear" w:color="auto" w:fill="auto"/>
             <w:vAlign w:val="center"/>
           </w:tcPr>
@@ -659,7 +659,7 @@
         </w:tc>
         <w:tc>
           <w:tcPr>
-            <w:tcW w:w="1950" w:type="dxa"/>
+            <w:tcW w:w="2132" w:type="dxa"/>
             <w:shd w:val="clear" w:color="auto" w:fill="auto"/>
             <w:vAlign w:val="center"/>
           </w:tcPr>
@@ -691,7 +691,7 @@
         </w:tc>
         <w:tc>
           <w:tcPr>
-            <w:tcW w:w="1650" w:type="dxa"/>
+            <w:tcW w:w="2268" w:type="dxa"/>
             <w:shd w:val="clear" w:color="auto" w:fill="auto"/>
             <w:vAlign w:val="center"/>
           </w:tcPr>
@@ -737,7 +737,7 @@
         </w:tc>
         <w:tc>
           <w:tcPr>
-            <w:tcW w:w="3630" w:type="dxa"/>
+            <w:tcW w:w="3827" w:type="dxa"/>
             <w:shd w:val="clear" w:color="auto" w:fill="auto"/>
             <w:vAlign w:val="center"/>
           </w:tcPr>
@@ -766,7 +766,7 @@
                           <pic:cNvPicPr preferRelativeResize="0"/>
                         </pic:nvPicPr>
                         <pic:blipFill>
-                          <a:blip r:embed="rId6"/>
+                          <a:blip r:embed="rId8"/>
                           <a:srcRect/>
                           <a:stretch>
                             <a:fillRect/>
@@ -792,8 +792,8 @@
         </w:tc>
         <w:tc>
           <w:tcPr>
-            <w:tcW w:w="1200" w:type="dxa"/>
-            <w:shd w:val="clear" w:color="auto" w:fill="auto"/>
+            <w:tcW w:w="709" w:type="dxa"/>
+            <w:shd w:val="clear" w:color="auto" w:fill="E2EFD9" w:themeFill="accent6" w:themeFillTint="33"/>
             <w:vAlign w:val="center"/>
           </w:tcPr>
           <w:p>
@@ -812,7 +812,7 @@
         </w:tc>
         <w:tc>
           <w:tcPr>
-            <w:tcW w:w="1725" w:type="dxa"/>
+            <w:tcW w:w="1559" w:type="dxa"/>
             <w:shd w:val="clear" w:color="auto" w:fill="auto"/>
             <w:vAlign w:val="center"/>
           </w:tcPr>
@@ -832,7 +832,7 @@
         </w:tc>
         <w:tc>
           <w:tcPr>
-            <w:tcW w:w="1590" w:type="dxa"/>
+            <w:tcW w:w="1250" w:type="dxa"/>
             <w:shd w:val="clear" w:color="auto" w:fill="auto"/>
             <w:vAlign w:val="center"/>
           </w:tcPr>
@@ -854,7 +854,7 @@
       <w:tr>
         <w:tc>
           <w:tcPr>
-            <w:tcW w:w="675" w:type="dxa"/>
+            <w:tcW w:w="562" w:type="dxa"/>
             <w:shd w:val="clear" w:color="auto" w:fill="auto"/>
             <w:vAlign w:val="center"/>
           </w:tcPr>
@@ -874,7 +874,7 @@
         </w:tc>
         <w:tc>
           <w:tcPr>
-            <w:tcW w:w="1065" w:type="dxa"/>
+            <w:tcW w:w="1418" w:type="dxa"/>
             <w:shd w:val="clear" w:color="auto" w:fill="auto"/>
             <w:vAlign w:val="center"/>
           </w:tcPr>
@@ -894,7 +894,7 @@
         </w:tc>
         <w:tc>
           <w:tcPr>
-            <w:tcW w:w="1935" w:type="dxa"/>
+            <w:tcW w:w="1695" w:type="dxa"/>
             <w:shd w:val="clear" w:color="auto" w:fill="auto"/>
             <w:vAlign w:val="center"/>
           </w:tcPr>
@@ -938,7 +938,7 @@
         </w:tc>
         <w:tc>
           <w:tcPr>
-            <w:tcW w:w="1950" w:type="dxa"/>
+            <w:tcW w:w="2132" w:type="dxa"/>
             <w:shd w:val="clear" w:color="auto" w:fill="auto"/>
             <w:vAlign w:val="center"/>
           </w:tcPr>
@@ -958,7 +958,7 @@
         </w:tc>
         <w:tc>
           <w:tcPr>
-            <w:tcW w:w="1650" w:type="dxa"/>
+            <w:tcW w:w="2268" w:type="dxa"/>
             <w:shd w:val="clear" w:color="auto" w:fill="auto"/>
             <w:vAlign w:val="center"/>
           </w:tcPr>
@@ -992,7 +992,7 @@
         </w:tc>
         <w:tc>
           <w:tcPr>
-            <w:tcW w:w="3630" w:type="dxa"/>
+            <w:tcW w:w="3827" w:type="dxa"/>
             <w:shd w:val="clear" w:color="auto" w:fill="auto"/>
             <w:vAlign w:val="center"/>
           </w:tcPr>
@@ -1025,7 +1025,7 @@
                           </pic:cNvPicPr>
                         </pic:nvPicPr>
                         <pic:blipFill>
-                          <a:blip r:embed="rId7">
+                          <a:blip r:embed="rId9">
                             <a:extLst>
                               <a:ext uri="{28A0092B-C50C-407E-A947-70E740481C1C}">
                                 <a14:useLocalDpi xmlns:a14="http://schemas.microsoft.com/office/drawing/2010/main" val="0"/>
@@ -1060,8 +1060,8 @@
         </w:tc>
         <w:tc>
           <w:tcPr>
-            <w:tcW w:w="1200" w:type="dxa"/>
-            <w:shd w:val="clear" w:color="auto" w:fill="auto"/>
+            <w:tcW w:w="709" w:type="dxa"/>
+            <w:shd w:val="clear" w:color="auto" w:fill="E2EFD9" w:themeFill="accent6" w:themeFillTint="33"/>
             <w:vAlign w:val="center"/>
           </w:tcPr>
           <w:p>
@@ -1080,7 +1080,7 @@
         </w:tc>
         <w:tc>
           <w:tcPr>
-            <w:tcW w:w="1725" w:type="dxa"/>
+            <w:tcW w:w="1559" w:type="dxa"/>
             <w:shd w:val="clear" w:color="auto" w:fill="auto"/>
             <w:vAlign w:val="center"/>
           </w:tcPr>
@@ -1100,7 +1100,7 @@
         </w:tc>
         <w:tc>
           <w:tcPr>
-            <w:tcW w:w="1590" w:type="dxa"/>
+            <w:tcW w:w="1250" w:type="dxa"/>
             <w:shd w:val="clear" w:color="auto" w:fill="auto"/>
             <w:vAlign w:val="center"/>
           </w:tcPr>
@@ -1124,7 +1124,7 @@
       <w:tr>
         <w:tc>
           <w:tcPr>
-            <w:tcW w:w="675" w:type="dxa"/>
+            <w:tcW w:w="562" w:type="dxa"/>
             <w:shd w:val="clear" w:color="auto" w:fill="auto"/>
             <w:vAlign w:val="center"/>
           </w:tcPr>
@@ -1145,7 +1145,7 @@
         </w:tc>
         <w:tc>
           <w:tcPr>
-            <w:tcW w:w="1065" w:type="dxa"/>
+            <w:tcW w:w="1418" w:type="dxa"/>
             <w:shd w:val="clear" w:color="auto" w:fill="auto"/>
             <w:vAlign w:val="center"/>
           </w:tcPr>
@@ -1165,7 +1165,7 @@
         </w:tc>
         <w:tc>
           <w:tcPr>
-            <w:tcW w:w="1935" w:type="dxa"/>
+            <w:tcW w:w="1695" w:type="dxa"/>
             <w:shd w:val="clear" w:color="auto" w:fill="auto"/>
             <w:vAlign w:val="center"/>
           </w:tcPr>
@@ -1197,7 +1197,7 @@
         </w:tc>
         <w:tc>
           <w:tcPr>
-            <w:tcW w:w="1950" w:type="dxa"/>
+            <w:tcW w:w="2132" w:type="dxa"/>
             <w:shd w:val="clear" w:color="auto" w:fill="auto"/>
             <w:vAlign w:val="center"/>
           </w:tcPr>
@@ -1217,7 +1217,7 @@
         </w:tc>
         <w:tc>
           <w:tcPr>
-            <w:tcW w:w="1650" w:type="dxa"/>
+            <w:tcW w:w="2268" w:type="dxa"/>
             <w:shd w:val="clear" w:color="auto" w:fill="auto"/>
             <w:vAlign w:val="center"/>
           </w:tcPr>
@@ -1264,7 +1264,7 @@
         </w:tc>
         <w:tc>
           <w:tcPr>
-            <w:tcW w:w="3630" w:type="dxa"/>
+            <w:tcW w:w="3827" w:type="dxa"/>
             <w:shd w:val="clear" w:color="auto" w:fill="auto"/>
             <w:vAlign w:val="center"/>
           </w:tcPr>
@@ -1293,7 +1293,7 @@
                           <pic:cNvPicPr preferRelativeResize="0"/>
                         </pic:nvPicPr>
                         <pic:blipFill>
-                          <a:blip r:embed="rId8"/>
+                          <a:blip r:embed="rId10"/>
                           <a:srcRect/>
                           <a:stretch>
                             <a:fillRect/>
@@ -1334,7 +1334,7 @@
                           <pic:cNvPicPr preferRelativeResize="0"/>
                         </pic:nvPicPr>
                         <pic:blipFill>
-                          <a:blip r:embed="rId9"/>
+                          <a:blip r:embed="rId11"/>
                           <a:srcRect/>
                           <a:stretch>
                             <a:fillRect/>
@@ -1360,8 +1360,8 @@
         </w:tc>
         <w:tc>
           <w:tcPr>
-            <w:tcW w:w="1200" w:type="dxa"/>
-            <w:shd w:val="clear" w:color="auto" w:fill="auto"/>
+            <w:tcW w:w="709" w:type="dxa"/>
+            <w:shd w:val="clear" w:color="auto" w:fill="E2EFD9" w:themeFill="accent6" w:themeFillTint="33"/>
             <w:vAlign w:val="center"/>
           </w:tcPr>
           <w:p>
@@ -1380,7 +1380,7 @@
         </w:tc>
         <w:tc>
           <w:tcPr>
-            <w:tcW w:w="1725" w:type="dxa"/>
+            <w:tcW w:w="1559" w:type="dxa"/>
             <w:shd w:val="clear" w:color="auto" w:fill="auto"/>
             <w:vAlign w:val="center"/>
           </w:tcPr>
@@ -1400,7 +1400,7 @@
         </w:tc>
         <w:tc>
           <w:tcPr>
-            <w:tcW w:w="1590" w:type="dxa"/>
+            <w:tcW w:w="1250" w:type="dxa"/>
             <w:shd w:val="clear" w:color="auto" w:fill="auto"/>
             <w:vAlign w:val="center"/>
           </w:tcPr>
@@ -1422,7 +1422,7 @@
       <w:tr>
         <w:tc>
           <w:tcPr>
-            <w:tcW w:w="675" w:type="dxa"/>
+            <w:tcW w:w="562" w:type="dxa"/>
             <w:shd w:val="clear" w:color="auto" w:fill="auto"/>
             <w:vAlign w:val="center"/>
           </w:tcPr>
@@ -1442,7 +1442,7 @@
         </w:tc>
         <w:tc>
           <w:tcPr>
-            <w:tcW w:w="1065" w:type="dxa"/>
+            <w:tcW w:w="1418" w:type="dxa"/>
             <w:shd w:val="clear" w:color="auto" w:fill="auto"/>
             <w:vAlign w:val="center"/>
           </w:tcPr>
@@ -1462,7 +1462,7 @@
         </w:tc>
         <w:tc>
           <w:tcPr>
-            <w:tcW w:w="1935" w:type="dxa"/>
+            <w:tcW w:w="1695" w:type="dxa"/>
             <w:shd w:val="clear" w:color="auto" w:fill="auto"/>
             <w:vAlign w:val="center"/>
           </w:tcPr>
@@ -1482,7 +1482,7 @@
         </w:tc>
         <w:tc>
           <w:tcPr>
-            <w:tcW w:w="1950" w:type="dxa"/>
+            <w:tcW w:w="2132" w:type="dxa"/>
             <w:shd w:val="clear" w:color="auto" w:fill="auto"/>
             <w:vAlign w:val="center"/>
           </w:tcPr>
@@ -1532,36 +1532,98 @@
         </w:tc>
         <w:tc>
           <w:tcPr>
-            <w:tcW w:w="1650" w:type="dxa"/>
-            <w:shd w:val="clear" w:color="auto" w:fill="auto"/>
-            <w:vAlign w:val="center"/>
-          </w:tcPr>
-          <w:p>
-            <w:pPr>
-              <w:rPr>
-                <w:rFonts w:ascii="Arial" w:eastAsia="Arial" w:hAnsi="Arial" w:cs="Arial"/>
-              </w:rPr>
-            </w:pPr>
-          </w:p>
-        </w:tc>
-        <w:tc>
-          <w:tcPr>
-            <w:tcW w:w="3630" w:type="dxa"/>
-            <w:shd w:val="clear" w:color="auto" w:fill="auto"/>
-            <w:vAlign w:val="center"/>
-          </w:tcPr>
-          <w:p>
-            <w:pPr>
-              <w:rPr>
-                <w:rFonts w:ascii="Arial" w:eastAsia="Arial" w:hAnsi="Arial" w:cs="Arial"/>
-              </w:rPr>
-            </w:pPr>
-          </w:p>
-        </w:tc>
-        <w:tc>
-          <w:tcPr>
-            <w:tcW w:w="1200" w:type="dxa"/>
-            <w:shd w:val="clear" w:color="auto" w:fill="auto"/>
+            <w:tcW w:w="2268" w:type="dxa"/>
+            <w:shd w:val="clear" w:color="auto" w:fill="auto"/>
+            <w:vAlign w:val="center"/>
+          </w:tcPr>
+          <w:p>
+            <w:pPr>
+              <w:rPr>
+                <w:rFonts w:ascii="Arial" w:eastAsia="Arial" w:hAnsi="Arial" w:cs="Arial"/>
+                <w:lang w:val="en-GB"/>
+              </w:rPr>
+            </w:pPr>
+            <w:r>
+              <w:rPr>
+                <w:rFonts w:ascii="Arial" w:eastAsia="Arial" w:hAnsi="Arial" w:cs="Arial"/>
+                <w:lang w:val="en-GB"/>
+              </w:rPr>
+              <w:t xml:space="preserve">Rent paid successfully </w:t>
+            </w:r>
+          </w:p>
+        </w:tc>
+        <w:tc>
+          <w:tcPr>
+            <w:tcW w:w="3827" w:type="dxa"/>
+            <w:shd w:val="clear" w:color="auto" w:fill="auto"/>
+            <w:vAlign w:val="center"/>
+          </w:tcPr>
+          <w:p>
+            <w:pPr>
+              <w:rPr>
+                <w:rFonts w:ascii="Arial" w:eastAsia="Arial" w:hAnsi="Arial" w:cs="Arial"/>
+              </w:rPr>
+            </w:pPr>
+            <w:r>
+              <w:rPr>
+                <w:rFonts w:ascii="Arial" w:eastAsia="Arial" w:hAnsi="Arial" w:cs="Arial"/>
+                <w:noProof/>
+              </w:rPr>
+              <w:drawing>
+                <wp:inline distT="0" distB="0" distL="0" distR="0" wp14:anchorId="221F2F0E" wp14:editId="3DCA6C54">
+                  <wp:extent cx="2186940" cy="701040"/>
+                  <wp:effectExtent l="0" t="0" r="3810" b="3810"/>
+                  <wp:docPr id="1745970349" name="圖片 4"/>
+                  <wp:cNvGraphicFramePr>
+                    <a:graphicFrameLocks xmlns:a="http://schemas.openxmlformats.org/drawingml/2006/main" noChangeAspect="1"/>
+                  </wp:cNvGraphicFramePr>
+                  <a:graphic xmlns:a="http://schemas.openxmlformats.org/drawingml/2006/main">
+                    <a:graphicData uri="http://schemas.openxmlformats.org/drawingml/2006/picture">
+                      <pic:pic xmlns:pic="http://schemas.openxmlformats.org/drawingml/2006/picture">
+                        <pic:nvPicPr>
+                          <pic:cNvPr id="0" name="Picture 4"/>
+                          <pic:cNvPicPr>
+                            <a:picLocks noChangeAspect="1" noChangeArrowheads="1"/>
+                          </pic:cNvPicPr>
+                        </pic:nvPicPr>
+                        <pic:blipFill>
+                          <a:blip r:embed="rId12">
+                            <a:extLst>
+                              <a:ext uri="{28A0092B-C50C-407E-A947-70E740481C1C}">
+                                <a14:useLocalDpi xmlns:a14="http://schemas.microsoft.com/office/drawing/2010/main" val="0"/>
+                              </a:ext>
+                            </a:extLst>
+                          </a:blip>
+                          <a:srcRect/>
+                          <a:stretch>
+                            <a:fillRect/>
+                          </a:stretch>
+                        </pic:blipFill>
+                        <pic:spPr bwMode="auto">
+                          <a:xfrm>
+                            <a:off x="0" y="0"/>
+                            <a:ext cx="2186940" cy="701040"/>
+                          </a:xfrm>
+                          <a:prstGeom prst="rect">
+                            <a:avLst/>
+                          </a:prstGeom>
+                          <a:noFill/>
+                          <a:ln>
+                            <a:noFill/>
+                          </a:ln>
+                        </pic:spPr>
+                      </pic:pic>
+                    </a:graphicData>
+                  </a:graphic>
+                </wp:inline>
+              </w:drawing>
+            </w:r>
+          </w:p>
+        </w:tc>
+        <w:tc>
+          <w:tcPr>
+            <w:tcW w:w="709" w:type="dxa"/>
+            <w:shd w:val="clear" w:color="auto" w:fill="E2EFD9" w:themeFill="accent6" w:themeFillTint="33"/>
             <w:vAlign w:val="center"/>
           </w:tcPr>
           <w:p>
@@ -1580,7 +1642,7 @@
         </w:tc>
         <w:tc>
           <w:tcPr>
-            <w:tcW w:w="1725" w:type="dxa"/>
+            <w:tcW w:w="1559" w:type="dxa"/>
             <w:shd w:val="clear" w:color="auto" w:fill="auto"/>
             <w:vAlign w:val="center"/>
           </w:tcPr>
@@ -1600,7 +1662,7 @@
         </w:tc>
         <w:tc>
           <w:tcPr>
-            <w:tcW w:w="1590" w:type="dxa"/>
+            <w:tcW w:w="1250" w:type="dxa"/>
             <w:shd w:val="clear" w:color="auto" w:fill="auto"/>
             <w:vAlign w:val="center"/>
           </w:tcPr>
@@ -1622,28 +1684,27 @@
       <w:tr>
         <w:tc>
           <w:tcPr>
-            <w:tcW w:w="675" w:type="dxa"/>
-            <w:shd w:val="clear" w:color="auto" w:fill="auto"/>
-            <w:vAlign w:val="center"/>
-          </w:tcPr>
-          <w:p>
-            <w:pPr>
-              <w:rPr>
-                <w:rFonts w:ascii="Arial" w:eastAsia="Arial" w:hAnsi="Arial" w:cs="Arial"/>
-              </w:rPr>
-            </w:pPr>
-            <w:r>
-              <w:rPr>
-                <w:rFonts w:ascii="Arial" w:eastAsia="Arial" w:hAnsi="Arial" w:cs="Arial"/>
-              </w:rPr>
-              <w:lastRenderedPageBreak/>
+            <w:tcW w:w="562" w:type="dxa"/>
+            <w:shd w:val="clear" w:color="auto" w:fill="auto"/>
+            <w:vAlign w:val="center"/>
+          </w:tcPr>
+          <w:p>
+            <w:pPr>
+              <w:rPr>
+                <w:rFonts w:ascii="Arial" w:eastAsia="Arial" w:hAnsi="Arial" w:cs="Arial"/>
+              </w:rPr>
+            </w:pPr>
+            <w:r>
+              <w:rPr>
+                <w:rFonts w:ascii="Arial" w:eastAsia="Arial" w:hAnsi="Arial" w:cs="Arial"/>
+              </w:rPr>
               <w:t>6</w:t>
             </w:r>
           </w:p>
         </w:tc>
         <w:tc>
           <w:tcPr>
-            <w:tcW w:w="1065" w:type="dxa"/>
+            <w:tcW w:w="1418" w:type="dxa"/>
             <w:shd w:val="clear" w:color="auto" w:fill="auto"/>
             <w:vAlign w:val="center"/>
           </w:tcPr>
@@ -1663,7 +1724,7 @@
         </w:tc>
         <w:tc>
           <w:tcPr>
-            <w:tcW w:w="1935" w:type="dxa"/>
+            <w:tcW w:w="1695" w:type="dxa"/>
             <w:shd w:val="clear" w:color="auto" w:fill="auto"/>
             <w:vAlign w:val="center"/>
           </w:tcPr>
@@ -1683,7 +1744,7 @@
         </w:tc>
         <w:tc>
           <w:tcPr>
-            <w:tcW w:w="1950" w:type="dxa"/>
+            <w:tcW w:w="2132" w:type="dxa"/>
             <w:shd w:val="clear" w:color="auto" w:fill="auto"/>
             <w:vAlign w:val="center"/>
           </w:tcPr>
@@ -1703,7 +1764,7 @@
         </w:tc>
         <w:tc>
           <w:tcPr>
-            <w:tcW w:w="1650" w:type="dxa"/>
+            <w:tcW w:w="2268" w:type="dxa"/>
             <w:shd w:val="clear" w:color="auto" w:fill="auto"/>
             <w:vAlign w:val="center"/>
           </w:tcPr>
@@ -1759,7 +1820,7 @@
         </w:tc>
         <w:tc>
           <w:tcPr>
-            <w:tcW w:w="3630" w:type="dxa"/>
+            <w:tcW w:w="3827" w:type="dxa"/>
             <w:shd w:val="clear" w:color="auto" w:fill="auto"/>
             <w:vAlign w:val="center"/>
           </w:tcPr>
@@ -1775,7 +1836,7 @@
                 <w:noProof/>
               </w:rPr>
               <w:drawing>
-                <wp:inline distT="0" distB="0" distL="0" distR="0" wp14:anchorId="082D06BC" wp14:editId="6792D7FB">
+                <wp:inline distT="0" distB="0" distL="0" distR="0" wp14:anchorId="082D06BC" wp14:editId="24CD0982">
                   <wp:extent cx="2186940" cy="1783080"/>
                   <wp:effectExtent l="0" t="0" r="3810" b="7620"/>
                   <wp:docPr id="82837514" name="圖片 1"/>
@@ -1792,7 +1853,7 @@
                           </pic:cNvPicPr>
                         </pic:nvPicPr>
                         <pic:blipFill>
-                          <a:blip r:embed="rId10" cstate="print">
+                          <a:blip r:embed="rId13" cstate="print">
                             <a:extLst>
                               <a:ext uri="{28A0092B-C50C-407E-A947-70E740481C1C}">
                                 <a14:useLocalDpi xmlns:a14="http://schemas.microsoft.com/office/drawing/2010/main" val="0"/>
@@ -1827,8 +1888,11 @@
         </w:tc>
         <w:tc>
           <w:tcPr>
-            <w:tcW w:w="1200" w:type="dxa"/>
-            <w:shd w:val="clear" w:color="auto" w:fill="auto"/>
+            <w:tcW w:w="709" w:type="dxa"/>
+            <w:tcBorders>
+              <w:bottom w:val="single" w:sz="4" w:space="0" w:color="000000"/>
+            </w:tcBorders>
+            <w:shd w:val="clear" w:color="auto" w:fill="E2EFD9" w:themeFill="accent6" w:themeFillTint="33"/>
             <w:vAlign w:val="center"/>
           </w:tcPr>
           <w:p>
@@ -1847,7 +1911,7 @@
         </w:tc>
         <w:tc>
           <w:tcPr>
-            <w:tcW w:w="1725" w:type="dxa"/>
+            <w:tcW w:w="1559" w:type="dxa"/>
             <w:shd w:val="clear" w:color="auto" w:fill="auto"/>
             <w:vAlign w:val="center"/>
           </w:tcPr>
@@ -1867,7 +1931,7 @@
         </w:tc>
         <w:tc>
           <w:tcPr>
-            <w:tcW w:w="1590" w:type="dxa"/>
+            <w:tcW w:w="1250" w:type="dxa"/>
             <w:shd w:val="clear" w:color="auto" w:fill="auto"/>
             <w:vAlign w:val="center"/>
           </w:tcPr>
@@ -1883,39 +1947,42 @@
               </w:rPr>
               <w:t xml:space="preserve">Test AI bidding </w:t>
             </w:r>
-            <w:r>
-              <w:rPr>
-                <w:rFonts w:ascii="Arial" w:eastAsia="Arial" w:hAnsi="Arial" w:cs="Arial"/>
-              </w:rPr>
-              <w:t>behavior</w:t>
-            </w:r>
+            <w:proofErr w:type="spellStart"/>
+            <w:r>
+              <w:rPr>
+                <w:rFonts w:ascii="Arial" w:eastAsia="Arial" w:hAnsi="Arial" w:cs="Arial"/>
+              </w:rPr>
+              <w:t>behaviour</w:t>
+            </w:r>
+            <w:proofErr w:type="spellEnd"/>
           </w:p>
         </w:tc>
       </w:tr>
       <w:tr>
         <w:tc>
           <w:tcPr>
-            <w:tcW w:w="675" w:type="dxa"/>
-            <w:shd w:val="clear" w:color="auto" w:fill="auto"/>
-            <w:vAlign w:val="center"/>
-          </w:tcPr>
-          <w:p>
-            <w:pPr>
-              <w:rPr>
-                <w:rFonts w:ascii="Arial" w:eastAsia="Arial" w:hAnsi="Arial" w:cs="Arial"/>
-              </w:rPr>
-            </w:pPr>
-            <w:r>
-              <w:rPr>
-                <w:rFonts w:ascii="Arial" w:eastAsia="Arial" w:hAnsi="Arial" w:cs="Arial"/>
-              </w:rPr>
+            <w:tcW w:w="562" w:type="dxa"/>
+            <w:shd w:val="clear" w:color="auto" w:fill="auto"/>
+            <w:vAlign w:val="center"/>
+          </w:tcPr>
+          <w:p>
+            <w:pPr>
+              <w:rPr>
+                <w:rFonts w:ascii="Arial" w:eastAsia="Arial" w:hAnsi="Arial" w:cs="Arial"/>
+              </w:rPr>
+            </w:pPr>
+            <w:r>
+              <w:rPr>
+                <w:rFonts w:ascii="Arial" w:eastAsia="Arial" w:hAnsi="Arial" w:cs="Arial"/>
+              </w:rPr>
+              <w:lastRenderedPageBreak/>
               <w:t>7</w:t>
             </w:r>
           </w:p>
         </w:tc>
         <w:tc>
           <w:tcPr>
-            <w:tcW w:w="1065" w:type="dxa"/>
+            <w:tcW w:w="1418" w:type="dxa"/>
             <w:shd w:val="clear" w:color="auto" w:fill="auto"/>
             <w:vAlign w:val="center"/>
           </w:tcPr>
@@ -1935,7 +2002,7 @@
         </w:tc>
         <w:tc>
           <w:tcPr>
-            <w:tcW w:w="1935" w:type="dxa"/>
+            <w:tcW w:w="1695" w:type="dxa"/>
             <w:shd w:val="clear" w:color="auto" w:fill="auto"/>
             <w:vAlign w:val="center"/>
           </w:tcPr>
@@ -1969,7 +2036,7 @@
         </w:tc>
         <w:tc>
           <w:tcPr>
-            <w:tcW w:w="1950" w:type="dxa"/>
+            <w:tcW w:w="2132" w:type="dxa"/>
             <w:shd w:val="clear" w:color="auto" w:fill="auto"/>
             <w:vAlign w:val="center"/>
           </w:tcPr>
@@ -1989,21 +2056,29 @@
         </w:tc>
         <w:tc>
           <w:tcPr>
-            <w:tcW w:w="1650" w:type="dxa"/>
-            <w:shd w:val="clear" w:color="auto" w:fill="auto"/>
-            <w:vAlign w:val="center"/>
-          </w:tcPr>
-          <w:p>
-            <w:pPr>
-              <w:rPr>
-                <w:rFonts w:ascii="Arial" w:eastAsia="Arial" w:hAnsi="Arial" w:cs="Arial"/>
-              </w:rPr>
-            </w:pPr>
-          </w:p>
-        </w:tc>
-        <w:tc>
-          <w:tcPr>
-            <w:tcW w:w="3630" w:type="dxa"/>
+            <w:tcW w:w="2268" w:type="dxa"/>
+            <w:shd w:val="clear" w:color="auto" w:fill="auto"/>
+            <w:vAlign w:val="center"/>
+          </w:tcPr>
+          <w:p>
+            <w:pPr>
+              <w:rPr>
+                <w:rFonts w:ascii="Arial" w:eastAsia="Arial" w:hAnsi="Arial" w:cs="Arial"/>
+                <w:lang w:val="en-GB"/>
+              </w:rPr>
+            </w:pPr>
+            <w:r>
+              <w:rPr>
+                <w:rFonts w:ascii="Arial" w:eastAsia="Arial" w:hAnsi="Arial" w:cs="Arial"/>
+                <w:lang w:val="en-GB"/>
+              </w:rPr>
+              <w:t>The card drawing UI is one lap late to display after the player lands on the card area.</w:t>
+            </w:r>
+          </w:p>
+        </w:tc>
+        <w:tc>
+          <w:tcPr>
+            <w:tcW w:w="3827" w:type="dxa"/>
             <w:shd w:val="clear" w:color="auto" w:fill="auto"/>
             <w:vAlign w:val="center"/>
           </w:tcPr>
@@ -2032,7 +2107,7 @@
                           <pic:cNvPicPr preferRelativeResize="0"/>
                         </pic:nvPicPr>
                         <pic:blipFill>
-                          <a:blip r:embed="rId11"/>
+                          <a:blip r:embed="rId14"/>
                           <a:srcRect/>
                           <a:stretch>
                             <a:fillRect/>
@@ -2058,8 +2133,11 @@
         </w:tc>
         <w:tc>
           <w:tcPr>
-            <w:tcW w:w="1200" w:type="dxa"/>
-            <w:shd w:val="clear" w:color="auto" w:fill="auto"/>
+            <w:tcW w:w="709" w:type="dxa"/>
+            <w:tcBorders>
+              <w:bottom w:val="single" w:sz="4" w:space="0" w:color="auto"/>
+            </w:tcBorders>
+            <w:shd w:val="clear" w:color="auto" w:fill="F5D8D3"/>
             <w:vAlign w:val="center"/>
           </w:tcPr>
           <w:p>
@@ -2078,27 +2156,58 @@
         </w:tc>
         <w:tc>
           <w:tcPr>
-            <w:tcW w:w="1725" w:type="dxa"/>
-            <w:shd w:val="clear" w:color="auto" w:fill="auto"/>
-            <w:vAlign w:val="center"/>
-          </w:tcPr>
-          <w:p>
-            <w:pPr>
-              <w:rPr>
-                <w:rFonts w:ascii="Arial" w:eastAsia="Arial" w:hAnsi="Arial" w:cs="Arial"/>
-              </w:rPr>
-            </w:pPr>
-            <w:r>
-              <w:rPr>
-                <w:rFonts w:ascii="Arial" w:eastAsia="Arial" w:hAnsi="Arial" w:cs="Arial"/>
-              </w:rPr>
-              <w:t>the problem should be in</w:t>
-            </w:r>
-          </w:p>
-        </w:tc>
-        <w:tc>
-          <w:tcPr>
-            <w:tcW w:w="1590" w:type="dxa"/>
+            <w:tcW w:w="1559" w:type="dxa"/>
+            <w:shd w:val="clear" w:color="auto" w:fill="auto"/>
+            <w:vAlign w:val="center"/>
+          </w:tcPr>
+          <w:p>
+            <w:pPr>
+              <w:rPr>
+                <w:rFonts w:ascii="Arial" w:eastAsia="Arial" w:hAnsi="Arial" w:cs="Arial"/>
+              </w:rPr>
+            </w:pPr>
+            <w:r>
+              <w:rPr>
+                <w:rFonts w:ascii="Arial" w:eastAsia="Arial" w:hAnsi="Arial" w:cs="Arial"/>
+              </w:rPr>
+              <w:t xml:space="preserve"> Fix</w:t>
+            </w:r>
+            <w:r>
+              <w:rPr>
+                <w:rFonts w:ascii="Arial" w:eastAsia="Arial" w:hAnsi="Arial" w:cs="Arial"/>
+              </w:rPr>
+              <w:t xml:space="preserve"> </w:t>
+            </w:r>
+            <w:r>
+              <w:rPr>
+                <w:rFonts w:ascii="Arial" w:eastAsia="Arial" w:hAnsi="Arial" w:cs="Arial"/>
+              </w:rPr>
+              <w:t xml:space="preserve">the </w:t>
+            </w:r>
+            <w:r>
+              <w:rPr>
+                <w:rFonts w:ascii="Arial" w:eastAsia="Arial" w:hAnsi="Arial" w:cs="Arial"/>
+              </w:rPr>
+              <w:t>flow of handling </w:t>
+            </w:r>
+            <w:r>
+              <w:rPr>
+                <w:rFonts w:ascii="Arial" w:eastAsia="Arial" w:hAnsi="Arial" w:cs="Arial"/>
+                <w:lang w:val="en-GB"/>
+              </w:rPr>
+              <w:t>card</w:t>
+            </w:r>
+            <w:r>
+              <w:rPr>
+                <w:rFonts w:ascii="Arial" w:eastAsia="Arial" w:hAnsi="Arial" w:cs="Arial"/>
+              </w:rPr>
+              <w:t> spaces</w:t>
+            </w:r>
+          </w:p>
+        </w:tc>
+        <w:tc>
+          <w:tcPr>
+            <w:tcW w:w="1250" w:type="dxa"/>
             <w:shd w:val="clear" w:color="auto" w:fill="auto"/>
             <w:vAlign w:val="center"/>
           </w:tcPr>
@@ -2120,7 +2229,7 @@
       <w:tr>
         <w:tc>
           <w:tcPr>
-            <w:tcW w:w="675" w:type="dxa"/>
+            <w:tcW w:w="562" w:type="dxa"/>
             <w:shd w:val="clear" w:color="auto" w:fill="auto"/>
             <w:vAlign w:val="center"/>
           </w:tcPr>
@@ -2140,7 +2249,7 @@
         </w:tc>
         <w:tc>
           <w:tcPr>
-            <w:tcW w:w="1065" w:type="dxa"/>
+            <w:tcW w:w="1418" w:type="dxa"/>
             <w:shd w:val="clear" w:color="auto" w:fill="auto"/>
             <w:vAlign w:val="center"/>
           </w:tcPr>
@@ -2160,7 +2269,7 @@
         </w:tc>
         <w:tc>
           <w:tcPr>
-            <w:tcW w:w="1935" w:type="dxa"/>
+            <w:tcW w:w="1695" w:type="dxa"/>
             <w:shd w:val="clear" w:color="auto" w:fill="auto"/>
             <w:vAlign w:val="center"/>
           </w:tcPr>
@@ -2180,27 +2289,39 @@
         </w:tc>
         <w:tc>
           <w:tcPr>
-            <w:tcW w:w="1950" w:type="dxa"/>
-            <w:shd w:val="clear" w:color="auto" w:fill="auto"/>
-            <w:vAlign w:val="center"/>
-          </w:tcPr>
-          <w:p>
-            <w:pPr>
-              <w:rPr>
-                <w:rFonts w:ascii="Arial" w:eastAsia="Arial" w:hAnsi="Arial" w:cs="Arial"/>
-              </w:rPr>
-            </w:pPr>
-            <w:r>
-              <w:rPr>
-                <w:rFonts w:ascii="Arial" w:eastAsia="Arial" w:hAnsi="Arial" w:cs="Arial"/>
-              </w:rPr>
-              <w:t>The player should move to jail, miss turns until conditions met</w:t>
-            </w:r>
-          </w:p>
-        </w:tc>
-        <w:tc>
-          <w:tcPr>
-            <w:tcW w:w="1650" w:type="dxa"/>
+            <w:tcW w:w="2132" w:type="dxa"/>
+            <w:shd w:val="clear" w:color="auto" w:fill="auto"/>
+            <w:vAlign w:val="center"/>
+          </w:tcPr>
+          <w:p>
+            <w:pPr>
+              <w:rPr>
+                <w:rFonts w:ascii="Arial" w:eastAsia="Arial" w:hAnsi="Arial" w:cs="Arial"/>
+              </w:rPr>
+            </w:pPr>
+            <w:r>
+              <w:rPr>
+                <w:rFonts w:ascii="Arial" w:eastAsia="Arial" w:hAnsi="Arial" w:cs="Arial"/>
+              </w:rPr>
+              <w:t>The player should move to jail, miss turns until conditions me</w:t>
+            </w:r>
+            <w:r>
+              <w:rPr>
+                <w:rFonts w:ascii="Arial" w:eastAsia="Arial" w:hAnsi="Arial" w:cs="Arial"/>
+              </w:rPr>
+              <w:t>e</w:t>
+            </w:r>
+            <w:r>
+              <w:rPr>
+                <w:rFonts w:ascii="Arial" w:eastAsia="Arial" w:hAnsi="Arial" w:cs="Arial"/>
+              </w:rPr>
+              <w:t>t</w:t>
+            </w:r>
+          </w:p>
+        </w:tc>
+        <w:tc>
+          <w:tcPr>
+            <w:tcW w:w="2268" w:type="dxa"/>
             <w:shd w:val="clear" w:color="auto" w:fill="auto"/>
             <w:vAlign w:val="center"/>
           </w:tcPr>
@@ -2246,7 +2367,7 @@
         </w:tc>
         <w:tc>
           <w:tcPr>
-            <w:tcW w:w="3630" w:type="dxa"/>
+            <w:tcW w:w="3827" w:type="dxa"/>
             <w:shd w:val="clear" w:color="auto" w:fill="auto"/>
             <w:vAlign w:val="center"/>
           </w:tcPr>
@@ -2279,7 +2400,7 @@
                           </pic:cNvPicPr>
                         </pic:nvPicPr>
                         <pic:blipFill>
-                          <a:blip r:embed="rId12">
+                          <a:blip r:embed="rId15">
                             <a:extLst>
                               <a:ext uri="{28A0092B-C50C-407E-A947-70E740481C1C}">
                                 <a14:useLocalDpi xmlns:a14="http://schemas.microsoft.com/office/drawing/2010/main" val="0"/>
@@ -2314,8 +2435,11 @@
         </w:tc>
         <w:tc>
           <w:tcPr>
-            <w:tcW w:w="1200" w:type="dxa"/>
-            <w:shd w:val="clear" w:color="auto" w:fill="auto"/>
+            <w:tcW w:w="709" w:type="dxa"/>
+            <w:tcBorders>
+              <w:top w:val="single" w:sz="4" w:space="0" w:color="auto"/>
+            </w:tcBorders>
+            <w:shd w:val="clear" w:color="auto" w:fill="E2EFD9" w:themeFill="accent6" w:themeFillTint="33"/>
             <w:vAlign w:val="center"/>
           </w:tcPr>
           <w:p>
@@ -2334,7 +2458,7 @@
         </w:tc>
         <w:tc>
           <w:tcPr>
-            <w:tcW w:w="1725" w:type="dxa"/>
+            <w:tcW w:w="1559" w:type="dxa"/>
             <w:shd w:val="clear" w:color="auto" w:fill="auto"/>
             <w:vAlign w:val="center"/>
           </w:tcPr>
@@ -2354,7 +2478,7 @@
         </w:tc>
         <w:tc>
           <w:tcPr>
-            <w:tcW w:w="1590" w:type="dxa"/>
+            <w:tcW w:w="1250" w:type="dxa"/>
             <w:shd w:val="clear" w:color="auto" w:fill="auto"/>
             <w:vAlign w:val="center"/>
           </w:tcPr>
@@ -2376,7 +2500,7 @@
       <w:tr>
         <w:tc>
           <w:tcPr>
-            <w:tcW w:w="675" w:type="dxa"/>
+            <w:tcW w:w="562" w:type="dxa"/>
             <w:shd w:val="clear" w:color="auto" w:fill="auto"/>
             <w:vAlign w:val="center"/>
           </w:tcPr>
@@ -2396,7 +2520,7 @@
         </w:tc>
         <w:tc>
           <w:tcPr>
-            <w:tcW w:w="1065" w:type="dxa"/>
+            <w:tcW w:w="1418" w:type="dxa"/>
             <w:shd w:val="clear" w:color="auto" w:fill="auto"/>
             <w:vAlign w:val="center"/>
           </w:tcPr>
@@ -2416,7 +2540,7 @@
         </w:tc>
         <w:tc>
           <w:tcPr>
-            <w:tcW w:w="1935" w:type="dxa"/>
+            <w:tcW w:w="1695" w:type="dxa"/>
             <w:shd w:val="clear" w:color="auto" w:fill="auto"/>
             <w:vAlign w:val="center"/>
           </w:tcPr>
@@ -2436,7 +2560,7 @@
         </w:tc>
         <w:tc>
           <w:tcPr>
-            <w:tcW w:w="1950" w:type="dxa"/>
+            <w:tcW w:w="2132" w:type="dxa"/>
             <w:shd w:val="clear" w:color="auto" w:fill="auto"/>
             <w:vAlign w:val="center"/>
           </w:tcPr>
@@ -2456,7 +2580,7 @@
         </w:tc>
         <w:tc>
           <w:tcPr>
-            <w:tcW w:w="1650" w:type="dxa"/>
+            <w:tcW w:w="2268" w:type="dxa"/>
             <w:shd w:val="clear" w:color="auto" w:fill="auto"/>
             <w:vAlign w:val="center"/>
           </w:tcPr>
@@ -2518,7 +2642,7 @@
         </w:tc>
         <w:tc>
           <w:tcPr>
-            <w:tcW w:w="3630" w:type="dxa"/>
+            <w:tcW w:w="3827" w:type="dxa"/>
             <w:shd w:val="clear" w:color="auto" w:fill="auto"/>
             <w:vAlign w:val="center"/>
           </w:tcPr>
@@ -2547,7 +2671,7 @@
                           <pic:cNvPicPr preferRelativeResize="0"/>
                         </pic:nvPicPr>
                         <pic:blipFill>
-                          <a:blip r:embed="rId13"/>
+                          <a:blip r:embed="rId16"/>
                           <a:srcRect/>
                           <a:stretch>
                             <a:fillRect/>
@@ -2573,87 +2697,27 @@
         </w:tc>
         <w:tc>
           <w:tcPr>
-            <w:tcW w:w="1200" w:type="dxa"/>
-            <w:shd w:val="clear" w:color="auto" w:fill="auto"/>
-            <w:vAlign w:val="center"/>
-          </w:tcPr>
-          <w:p>
-            <w:pPr>
-              <w:rPr>
-                <w:rFonts w:ascii="Arial" w:eastAsia="Arial" w:hAnsi="Arial" w:cs="Arial"/>
-              </w:rPr>
-            </w:pPr>
-            <w:r>
-              <w:rPr>
-                <w:rFonts w:ascii="Arial" w:eastAsia="Arial" w:hAnsi="Arial" w:cs="Arial"/>
-              </w:rPr>
-              <w:t>Pas</w:t>
-            </w:r>
-            <w:r>
-              <w:rPr>
-                <w:rFonts w:ascii="Arial" w:eastAsia="Arial" w:hAnsi="Arial" w:cs="Arial"/>
-                <w:noProof/>
-              </w:rPr>
-              <w:drawing>
-                <wp:inline distT="0" distB="0" distL="0" distR="0" wp14:anchorId="2FF733A8" wp14:editId="3662C92C">
-                  <wp:extent cx="647700" cy="259080"/>
-                  <wp:effectExtent l="0" t="0" r="0" b="7620"/>
-                  <wp:docPr id="1974560941" name="圖片 3"/>
-                  <wp:cNvGraphicFramePr>
-                    <a:graphicFrameLocks xmlns:a="http://schemas.openxmlformats.org/drawingml/2006/main" noChangeAspect="1"/>
-                  </wp:cNvGraphicFramePr>
-                  <a:graphic xmlns:a="http://schemas.openxmlformats.org/drawingml/2006/main">
-                    <a:graphicData uri="http://schemas.openxmlformats.org/drawingml/2006/picture">
-                      <pic:pic xmlns:pic="http://schemas.openxmlformats.org/drawingml/2006/picture">
-                        <pic:nvPicPr>
-                          <pic:cNvPr id="0" name="Picture 3"/>
-                          <pic:cNvPicPr>
-                            <a:picLocks noChangeAspect="1" noChangeArrowheads="1"/>
-                          </pic:cNvPicPr>
-                        </pic:nvPicPr>
-                        <pic:blipFill>
-                          <a:blip r:embed="rId14" cstate="print">
-                            <a:extLst>
-                              <a:ext uri="{28A0092B-C50C-407E-A947-70E740481C1C}">
-                                <a14:useLocalDpi xmlns:a14="http://schemas.microsoft.com/office/drawing/2010/main" val="0"/>
-                              </a:ext>
-                            </a:extLst>
-                          </a:blip>
-                          <a:srcRect/>
-                          <a:stretch>
-                            <a:fillRect/>
-                          </a:stretch>
-                        </pic:blipFill>
-                        <pic:spPr bwMode="auto">
-                          <a:xfrm>
-                            <a:off x="0" y="0"/>
-                            <a:ext cx="647700" cy="259080"/>
-                          </a:xfrm>
-                          <a:prstGeom prst="rect">
-                            <a:avLst/>
-                          </a:prstGeom>
-                          <a:noFill/>
-                          <a:ln>
-                            <a:noFill/>
-                          </a:ln>
-                        </pic:spPr>
-                      </pic:pic>
-                    </a:graphicData>
-                  </a:graphic>
-                </wp:inline>
-              </w:drawing>
-            </w:r>
-            <w:r>
-              <w:rPr>
-                <w:rFonts w:ascii="Arial" w:eastAsia="Arial" w:hAnsi="Arial" w:cs="Arial"/>
-              </w:rPr>
-              <w:t>s</w:t>
-            </w:r>
-          </w:p>
-        </w:tc>
-        <w:tc>
-          <w:tcPr>
-            <w:tcW w:w="1725" w:type="dxa"/>
+            <w:tcW w:w="709" w:type="dxa"/>
+            <w:shd w:val="clear" w:color="auto" w:fill="E2EFD9" w:themeFill="accent6" w:themeFillTint="33"/>
+            <w:vAlign w:val="center"/>
+          </w:tcPr>
+          <w:p>
+            <w:pPr>
+              <w:rPr>
+                <w:rFonts w:ascii="Arial" w:eastAsia="Arial" w:hAnsi="Arial" w:cs="Arial"/>
+              </w:rPr>
+            </w:pPr>
+            <w:r>
+              <w:rPr>
+                <w:rFonts w:ascii="Arial" w:eastAsia="Arial" w:hAnsi="Arial" w:cs="Arial"/>
+              </w:rPr>
+              <w:t>Pass</w:t>
+            </w:r>
+          </w:p>
+        </w:tc>
+        <w:tc>
+          <w:tcPr>
+            <w:tcW w:w="1559" w:type="dxa"/>
             <w:shd w:val="clear" w:color="auto" w:fill="auto"/>
             <w:vAlign w:val="center"/>
           </w:tcPr>
@@ -2673,7 +2737,7 @@
         </w:tc>
         <w:tc>
           <w:tcPr>
-            <w:tcW w:w="1590" w:type="dxa"/>
+            <w:tcW w:w="1250" w:type="dxa"/>
             <w:shd w:val="clear" w:color="auto" w:fill="auto"/>
             <w:vAlign w:val="center"/>
           </w:tcPr>
@@ -2695,28 +2759,27 @@
       <w:tr>
         <w:tc>
           <w:tcPr>
-            <w:tcW w:w="675" w:type="dxa"/>
-            <w:shd w:val="clear" w:color="auto" w:fill="auto"/>
-            <w:vAlign w:val="center"/>
-          </w:tcPr>
-          <w:p>
-            <w:pPr>
-              <w:rPr>
-                <w:rFonts w:ascii="Arial" w:eastAsia="Arial" w:hAnsi="Arial" w:cs="Arial"/>
-              </w:rPr>
-            </w:pPr>
-            <w:r>
-              <w:rPr>
-                <w:rFonts w:ascii="Arial" w:eastAsia="Arial" w:hAnsi="Arial" w:cs="Arial"/>
-              </w:rPr>
-              <w:lastRenderedPageBreak/>
+            <w:tcW w:w="562" w:type="dxa"/>
+            <w:shd w:val="clear" w:color="auto" w:fill="auto"/>
+            <w:vAlign w:val="center"/>
+          </w:tcPr>
+          <w:p>
+            <w:pPr>
+              <w:rPr>
+                <w:rFonts w:ascii="Arial" w:eastAsia="Arial" w:hAnsi="Arial" w:cs="Arial"/>
+              </w:rPr>
+            </w:pPr>
+            <w:r>
+              <w:rPr>
+                <w:rFonts w:ascii="Arial" w:eastAsia="Arial" w:hAnsi="Arial" w:cs="Arial"/>
+              </w:rPr>
               <w:t>10</w:t>
             </w:r>
           </w:p>
         </w:tc>
         <w:tc>
           <w:tcPr>
-            <w:tcW w:w="1065" w:type="dxa"/>
+            <w:tcW w:w="1418" w:type="dxa"/>
             <w:shd w:val="clear" w:color="auto" w:fill="auto"/>
             <w:vAlign w:val="center"/>
           </w:tcPr>
@@ -2736,7 +2799,7 @@
         </w:tc>
         <w:tc>
           <w:tcPr>
-            <w:tcW w:w="1935" w:type="dxa"/>
+            <w:tcW w:w="1695" w:type="dxa"/>
             <w:shd w:val="clear" w:color="auto" w:fill="auto"/>
             <w:vAlign w:val="center"/>
           </w:tcPr>
@@ -2756,7 +2819,7 @@
         </w:tc>
         <w:tc>
           <w:tcPr>
-            <w:tcW w:w="1950" w:type="dxa"/>
+            <w:tcW w:w="2132" w:type="dxa"/>
             <w:shd w:val="clear" w:color="auto" w:fill="auto"/>
             <w:vAlign w:val="center"/>
           </w:tcPr>
@@ -2788,7 +2851,7 @@
         </w:tc>
         <w:tc>
           <w:tcPr>
-            <w:tcW w:w="1650" w:type="dxa"/>
+            <w:tcW w:w="2268" w:type="dxa"/>
             <w:shd w:val="clear" w:color="auto" w:fill="auto"/>
             <w:vAlign w:val="center"/>
           </w:tcPr>
@@ -2822,7 +2885,7 @@
         </w:tc>
         <w:tc>
           <w:tcPr>
-            <w:tcW w:w="3630" w:type="dxa"/>
+            <w:tcW w:w="3827" w:type="dxa"/>
             <w:shd w:val="clear" w:color="auto" w:fill="auto"/>
             <w:vAlign w:val="center"/>
           </w:tcPr>
@@ -2851,7 +2914,7 @@
                           <pic:cNvPicPr preferRelativeResize="0"/>
                         </pic:nvPicPr>
                         <pic:blipFill>
-                          <a:blip r:embed="rId15"/>
+                          <a:blip r:embed="rId17"/>
                           <a:srcRect/>
                           <a:stretch>
                             <a:fillRect/>
@@ -2877,8 +2940,8 @@
         </w:tc>
         <w:tc>
           <w:tcPr>
-            <w:tcW w:w="1200" w:type="dxa"/>
-            <w:shd w:val="clear" w:color="auto" w:fill="auto"/>
+            <w:tcW w:w="709" w:type="dxa"/>
+            <w:shd w:val="clear" w:color="auto" w:fill="E2EFD9" w:themeFill="accent6" w:themeFillTint="33"/>
             <w:vAlign w:val="center"/>
           </w:tcPr>
           <w:p>
@@ -2897,7 +2960,7 @@
         </w:tc>
         <w:tc>
           <w:tcPr>
-            <w:tcW w:w="1725" w:type="dxa"/>
+            <w:tcW w:w="1559" w:type="dxa"/>
             <w:shd w:val="clear" w:color="auto" w:fill="auto"/>
             <w:vAlign w:val="center"/>
           </w:tcPr>
@@ -2917,7 +2980,7 @@
         </w:tc>
         <w:tc>
           <w:tcPr>
-            <w:tcW w:w="1590" w:type="dxa"/>
+            <w:tcW w:w="1250" w:type="dxa"/>
             <w:shd w:val="clear" w:color="auto" w:fill="auto"/>
             <w:vAlign w:val="center"/>
           </w:tcPr>
@@ -2951,7 +3014,7 @@
       <w:tr>
         <w:tc>
           <w:tcPr>
-            <w:tcW w:w="675" w:type="dxa"/>
+            <w:tcW w:w="562" w:type="dxa"/>
             <w:shd w:val="clear" w:color="auto" w:fill="auto"/>
             <w:vAlign w:val="center"/>
           </w:tcPr>
@@ -2971,7 +3034,7 @@
         </w:tc>
         <w:tc>
           <w:tcPr>
-            <w:tcW w:w="1065" w:type="dxa"/>
+            <w:tcW w:w="1418" w:type="dxa"/>
             <w:shd w:val="clear" w:color="auto" w:fill="auto"/>
             <w:vAlign w:val="center"/>
           </w:tcPr>
@@ -2991,7 +3054,7 @@
         </w:tc>
         <w:tc>
           <w:tcPr>
-            <w:tcW w:w="1935" w:type="dxa"/>
+            <w:tcW w:w="1695" w:type="dxa"/>
             <w:shd w:val="clear" w:color="auto" w:fill="auto"/>
             <w:vAlign w:val="center"/>
           </w:tcPr>
@@ -3023,7 +3086,7 @@
         </w:tc>
         <w:tc>
           <w:tcPr>
-            <w:tcW w:w="1950" w:type="dxa"/>
+            <w:tcW w:w="2132" w:type="dxa"/>
             <w:shd w:val="clear" w:color="auto" w:fill="auto"/>
             <w:vAlign w:val="center"/>
           </w:tcPr>
@@ -3043,7 +3106,7 @@
         </w:tc>
         <w:tc>
           <w:tcPr>
-            <w:tcW w:w="1650" w:type="dxa"/>
+            <w:tcW w:w="2268" w:type="dxa"/>
             <w:shd w:val="clear" w:color="auto" w:fill="auto"/>
             <w:vAlign w:val="center"/>
           </w:tcPr>
@@ -3071,22 +3134,76 @@
         </w:tc>
         <w:tc>
           <w:tcPr>
-            <w:tcW w:w="3630" w:type="dxa"/>
-            <w:shd w:val="clear" w:color="auto" w:fill="auto"/>
-            <w:vAlign w:val="center"/>
-          </w:tcPr>
-          <w:p>
-            <w:pPr>
-              <w:rPr>
-                <w:rFonts w:ascii="Arial" w:eastAsia="Arial" w:hAnsi="Arial" w:cs="Arial"/>
-              </w:rPr>
-            </w:pPr>
-          </w:p>
-        </w:tc>
-        <w:tc>
-          <w:tcPr>
-            <w:tcW w:w="1200" w:type="dxa"/>
-            <w:shd w:val="clear" w:color="auto" w:fill="auto"/>
+            <w:tcW w:w="3827" w:type="dxa"/>
+            <w:shd w:val="clear" w:color="auto" w:fill="auto"/>
+            <w:vAlign w:val="center"/>
+          </w:tcPr>
+          <w:p>
+            <w:pPr>
+              <w:rPr>
+                <w:rFonts w:ascii="Arial" w:eastAsia="Arial" w:hAnsi="Arial" w:cs="Arial"/>
+              </w:rPr>
+            </w:pPr>
+            <w:r>
+              <w:rPr>
+                <w:rFonts w:ascii="Arial" w:eastAsia="Arial" w:hAnsi="Arial" w:cs="Arial"/>
+                <w:noProof/>
+              </w:rPr>
+              <w:drawing>
+                <wp:inline distT="0" distB="0" distL="0" distR="0" wp14:anchorId="7A0B8A6A" wp14:editId="4F5EBC85">
+                  <wp:extent cx="2186940" cy="617220"/>
+                  <wp:effectExtent l="0" t="0" r="3810" b="0"/>
+                  <wp:docPr id="179445761" name="圖片 3"/>
+                  <wp:cNvGraphicFramePr>
+                    <a:graphicFrameLocks xmlns:a="http://schemas.openxmlformats.org/drawingml/2006/main" noChangeAspect="1"/>
+                  </wp:cNvGraphicFramePr>
+                  <a:graphic xmlns:a="http://schemas.openxmlformats.org/drawingml/2006/main">
+                    <a:graphicData uri="http://schemas.openxmlformats.org/drawingml/2006/picture">
+                      <pic:pic xmlns:pic="http://schemas.openxmlformats.org/drawingml/2006/picture">
+                        <pic:nvPicPr>
+                          <pic:cNvPr id="0" name="Picture 3"/>
+                          <pic:cNvPicPr>
+                            <a:picLocks noChangeAspect="1" noChangeArrowheads="1"/>
+                          </pic:cNvPicPr>
+                        </pic:nvPicPr>
+                        <pic:blipFill>
+                          <a:blip r:embed="rId18">
+                            <a:extLst>
+                              <a:ext uri="{28A0092B-C50C-407E-A947-70E740481C1C}">
+                                <a14:useLocalDpi xmlns:a14="http://schemas.microsoft.com/office/drawing/2010/main" val="0"/>
+                              </a:ext>
+                            </a:extLst>
+                          </a:blip>
+                          <a:srcRect/>
+                          <a:stretch>
+                            <a:fillRect/>
+                          </a:stretch>
+                        </pic:blipFill>
+                        <pic:spPr bwMode="auto">
+                          <a:xfrm>
+                            <a:off x="0" y="0"/>
+                            <a:ext cx="2186940" cy="617220"/>
+                          </a:xfrm>
+                          <a:prstGeom prst="rect">
+                            <a:avLst/>
+                          </a:prstGeom>
+                          <a:noFill/>
+                          <a:ln>
+                            <a:noFill/>
+                          </a:ln>
+                        </pic:spPr>
+                      </pic:pic>
+                    </a:graphicData>
+                  </a:graphic>
+                </wp:inline>
+              </w:drawing>
+            </w:r>
+          </w:p>
+        </w:tc>
+        <w:tc>
+          <w:tcPr>
+            <w:tcW w:w="709" w:type="dxa"/>
+            <w:shd w:val="clear" w:color="auto" w:fill="E2EFD9" w:themeFill="accent6" w:themeFillTint="33"/>
             <w:vAlign w:val="center"/>
           </w:tcPr>
           <w:p>
@@ -3105,7 +3222,7 @@
         </w:tc>
         <w:tc>
           <w:tcPr>
-            <w:tcW w:w="1725" w:type="dxa"/>
+            <w:tcW w:w="1559" w:type="dxa"/>
             <w:shd w:val="clear" w:color="auto" w:fill="auto"/>
             <w:vAlign w:val="center"/>
           </w:tcPr>
@@ -3125,7 +3242,7 @@
         </w:tc>
         <w:tc>
           <w:tcPr>
-            <w:tcW w:w="1590" w:type="dxa"/>
+            <w:tcW w:w="1250" w:type="dxa"/>
             <w:shd w:val="clear" w:color="auto" w:fill="auto"/>
             <w:vAlign w:val="center"/>
           </w:tcPr>
@@ -3147,27 +3264,28 @@
       <w:tr>
         <w:tc>
           <w:tcPr>
-            <w:tcW w:w="675" w:type="dxa"/>
-            <w:shd w:val="clear" w:color="auto" w:fill="auto"/>
-            <w:vAlign w:val="center"/>
-          </w:tcPr>
-          <w:p>
-            <w:pPr>
-              <w:rPr>
-                <w:rFonts w:ascii="Arial" w:eastAsia="Arial" w:hAnsi="Arial" w:cs="Arial"/>
-              </w:rPr>
-            </w:pPr>
-            <w:r>
-              <w:rPr>
-                <w:rFonts w:ascii="Arial" w:eastAsia="Arial" w:hAnsi="Arial" w:cs="Arial"/>
-              </w:rPr>
+            <w:tcW w:w="562" w:type="dxa"/>
+            <w:shd w:val="clear" w:color="auto" w:fill="auto"/>
+            <w:vAlign w:val="center"/>
+          </w:tcPr>
+          <w:p>
+            <w:pPr>
+              <w:rPr>
+                <w:rFonts w:ascii="Arial" w:eastAsia="Arial" w:hAnsi="Arial" w:cs="Arial"/>
+              </w:rPr>
+            </w:pPr>
+            <w:r>
+              <w:rPr>
+                <w:rFonts w:ascii="Arial" w:eastAsia="Arial" w:hAnsi="Arial" w:cs="Arial"/>
+              </w:rPr>
+              <w:lastRenderedPageBreak/>
               <w:t>12</w:t>
             </w:r>
           </w:p>
         </w:tc>
         <w:tc>
           <w:tcPr>
-            <w:tcW w:w="1065" w:type="dxa"/>
+            <w:tcW w:w="1418" w:type="dxa"/>
             <w:shd w:val="clear" w:color="auto" w:fill="auto"/>
             <w:vAlign w:val="center"/>
           </w:tcPr>
@@ -3187,7 +3305,7 @@
         </w:tc>
         <w:tc>
           <w:tcPr>
-            <w:tcW w:w="1935" w:type="dxa"/>
+            <w:tcW w:w="1695" w:type="dxa"/>
             <w:shd w:val="clear" w:color="auto" w:fill="auto"/>
             <w:vAlign w:val="center"/>
           </w:tcPr>
@@ -3231,7 +3349,7 @@
         </w:tc>
         <w:tc>
           <w:tcPr>
-            <w:tcW w:w="1950" w:type="dxa"/>
+            <w:tcW w:w="2132" w:type="dxa"/>
             <w:shd w:val="clear" w:color="auto" w:fill="auto"/>
             <w:vAlign w:val="center"/>
           </w:tcPr>
@@ -3251,27 +3369,33 @@
         </w:tc>
         <w:tc>
           <w:tcPr>
-            <w:tcW w:w="1650" w:type="dxa"/>
-            <w:shd w:val="clear" w:color="auto" w:fill="auto"/>
-            <w:vAlign w:val="center"/>
-          </w:tcPr>
-          <w:p>
-            <w:pPr>
-              <w:rPr>
-                <w:rFonts w:ascii="Arial" w:eastAsia="Arial" w:hAnsi="Arial" w:cs="Arial"/>
-              </w:rPr>
-            </w:pPr>
-            <w:r>
-              <w:rPr>
-                <w:rFonts w:ascii="Arial" w:eastAsia="Arial" w:hAnsi="Arial" w:cs="Arial"/>
-              </w:rPr>
-              <w:t>works</w:t>
-            </w:r>
-          </w:p>
-        </w:tc>
-        <w:tc>
-          <w:tcPr>
-            <w:tcW w:w="3630" w:type="dxa"/>
+            <w:tcW w:w="2268" w:type="dxa"/>
+            <w:shd w:val="clear" w:color="auto" w:fill="auto"/>
+            <w:vAlign w:val="center"/>
+          </w:tcPr>
+          <w:p>
+            <w:pPr>
+              <w:rPr>
+                <w:rFonts w:ascii="Arial" w:eastAsia="Arial" w:hAnsi="Arial" w:cs="Arial"/>
+              </w:rPr>
+            </w:pPr>
+            <w:r>
+              <w:rPr>
+                <w:rFonts w:ascii="Arial" w:eastAsia="Arial" w:hAnsi="Arial" w:cs="Arial"/>
+              </w:rPr>
+              <w:t>work</w:t>
+            </w:r>
+            <w:r>
+              <w:rPr>
+                <w:rFonts w:ascii="Arial" w:eastAsia="Arial" w:hAnsi="Arial" w:cs="Arial"/>
+              </w:rPr>
+              <w:t>ing</w:t>
+            </w:r>
+          </w:p>
+        </w:tc>
+        <w:tc>
+          <w:tcPr>
+            <w:tcW w:w="3827" w:type="dxa"/>
             <w:shd w:val="clear" w:color="auto" w:fill="auto"/>
             <w:vAlign w:val="center"/>
           </w:tcPr>
@@ -3300,7 +3424,7 @@
                           <pic:cNvPicPr preferRelativeResize="0"/>
                         </pic:nvPicPr>
                         <pic:blipFill>
-                          <a:blip r:embed="rId16"/>
+                          <a:blip r:embed="rId19"/>
                           <a:srcRect/>
                           <a:stretch>
                             <a:fillRect/>
@@ -3326,8 +3450,8 @@
         </w:tc>
         <w:tc>
           <w:tcPr>
-            <w:tcW w:w="1200" w:type="dxa"/>
-            <w:shd w:val="clear" w:color="auto" w:fill="auto"/>
+            <w:tcW w:w="709" w:type="dxa"/>
+            <w:shd w:val="clear" w:color="auto" w:fill="E2EFD9" w:themeFill="accent6" w:themeFillTint="33"/>
             <w:vAlign w:val="center"/>
           </w:tcPr>
           <w:p>
@@ -3346,7 +3470,7 @@
         </w:tc>
         <w:tc>
           <w:tcPr>
-            <w:tcW w:w="1725" w:type="dxa"/>
+            <w:tcW w:w="1559" w:type="dxa"/>
             <w:shd w:val="clear" w:color="auto" w:fill="auto"/>
             <w:vAlign w:val="center"/>
           </w:tcPr>
@@ -3366,7 +3490,7 @@
         </w:tc>
         <w:tc>
           <w:tcPr>
-            <w:tcW w:w="1590" w:type="dxa"/>
+            <w:tcW w:w="1250" w:type="dxa"/>
             <w:shd w:val="clear" w:color="auto" w:fill="auto"/>
             <w:vAlign w:val="center"/>
           </w:tcPr>
@@ -3388,7 +3512,7 @@
       <w:tr>
         <w:tc>
           <w:tcPr>
-            <w:tcW w:w="675" w:type="dxa"/>
+            <w:tcW w:w="562" w:type="dxa"/>
             <w:shd w:val="clear" w:color="auto" w:fill="auto"/>
             <w:vAlign w:val="center"/>
           </w:tcPr>
@@ -3408,7 +3532,7 @@
         </w:tc>
         <w:tc>
           <w:tcPr>
-            <w:tcW w:w="1065" w:type="dxa"/>
+            <w:tcW w:w="1418" w:type="dxa"/>
             <w:shd w:val="clear" w:color="auto" w:fill="auto"/>
             <w:vAlign w:val="center"/>
           </w:tcPr>
@@ -3428,7 +3552,7 @@
         </w:tc>
         <w:tc>
           <w:tcPr>
-            <w:tcW w:w="1935" w:type="dxa"/>
+            <w:tcW w:w="1695" w:type="dxa"/>
             <w:shd w:val="clear" w:color="auto" w:fill="auto"/>
             <w:vAlign w:val="center"/>
           </w:tcPr>
@@ -3448,7 +3572,7 @@
         </w:tc>
         <w:tc>
           <w:tcPr>
-            <w:tcW w:w="1950" w:type="dxa"/>
+            <w:tcW w:w="2132" w:type="dxa"/>
             <w:shd w:val="clear" w:color="auto" w:fill="auto"/>
             <w:vAlign w:val="center"/>
           </w:tcPr>
@@ -3468,7 +3592,7 @@
         </w:tc>
         <w:tc>
           <w:tcPr>
-            <w:tcW w:w="1650" w:type="dxa"/>
+            <w:tcW w:w="2268" w:type="dxa"/>
             <w:shd w:val="clear" w:color="auto" w:fill="auto"/>
             <w:vAlign w:val="center"/>
           </w:tcPr>
@@ -3488,7 +3612,7 @@
         </w:tc>
         <w:tc>
           <w:tcPr>
-            <w:tcW w:w="3630" w:type="dxa"/>
+            <w:tcW w:w="3827" w:type="dxa"/>
             <w:shd w:val="clear" w:color="auto" w:fill="auto"/>
             <w:vAlign w:val="center"/>
           </w:tcPr>
@@ -3517,7 +3641,7 @@
                           <pic:cNvPicPr preferRelativeResize="0"/>
                         </pic:nvPicPr>
                         <pic:blipFill>
-                          <a:blip r:embed="rId17"/>
+                          <a:blip r:embed="rId20"/>
                           <a:srcRect/>
                           <a:stretch>
                             <a:fillRect/>
@@ -3543,8 +3667,8 @@
         </w:tc>
         <w:tc>
           <w:tcPr>
-            <w:tcW w:w="1200" w:type="dxa"/>
-            <w:shd w:val="clear" w:color="auto" w:fill="auto"/>
+            <w:tcW w:w="709" w:type="dxa"/>
+            <w:shd w:val="clear" w:color="auto" w:fill="E2EFD9" w:themeFill="accent6" w:themeFillTint="33"/>
             <w:vAlign w:val="center"/>
           </w:tcPr>
           <w:p>
@@ -3563,7 +3687,7 @@
         </w:tc>
         <w:tc>
           <w:tcPr>
-            <w:tcW w:w="1725" w:type="dxa"/>
+            <w:tcW w:w="1559" w:type="dxa"/>
             <w:shd w:val="clear" w:color="auto" w:fill="auto"/>
             <w:vAlign w:val="center"/>
           </w:tcPr>
@@ -3583,7 +3707,7 @@
         </w:tc>
         <w:tc>
           <w:tcPr>
-            <w:tcW w:w="1590" w:type="dxa"/>
+            <w:tcW w:w="1250" w:type="dxa"/>
             <w:shd w:val="clear" w:color="auto" w:fill="auto"/>
             <w:vAlign w:val="center"/>
           </w:tcPr>
@@ -3605,7 +3729,7 @@
       <w:tr>
         <w:tc>
           <w:tcPr>
-            <w:tcW w:w="675" w:type="dxa"/>
+            <w:tcW w:w="562" w:type="dxa"/>
             <w:shd w:val="clear" w:color="auto" w:fill="auto"/>
             <w:vAlign w:val="center"/>
           </w:tcPr>
@@ -3625,7 +3749,7 @@
         </w:tc>
         <w:tc>
           <w:tcPr>
-            <w:tcW w:w="1065" w:type="dxa"/>
+            <w:tcW w:w="1418" w:type="dxa"/>
             <w:shd w:val="clear" w:color="auto" w:fill="auto"/>
             <w:vAlign w:val="center"/>
           </w:tcPr>
@@ -3645,7 +3769,7 @@
         </w:tc>
         <w:tc>
           <w:tcPr>
-            <w:tcW w:w="1935" w:type="dxa"/>
+            <w:tcW w:w="1695" w:type="dxa"/>
             <w:shd w:val="clear" w:color="auto" w:fill="auto"/>
             <w:vAlign w:val="center"/>
           </w:tcPr>
@@ -3665,7 +3789,7 @@
         </w:tc>
         <w:tc>
           <w:tcPr>
-            <w:tcW w:w="1950" w:type="dxa"/>
+            <w:tcW w:w="2132" w:type="dxa"/>
             <w:shd w:val="clear" w:color="auto" w:fill="auto"/>
             <w:vAlign w:val="center"/>
           </w:tcPr>
@@ -3685,7 +3809,7 @@
         </w:tc>
         <w:tc>
           <w:tcPr>
-            <w:tcW w:w="1650" w:type="dxa"/>
+            <w:tcW w:w="2268" w:type="dxa"/>
             <w:shd w:val="clear" w:color="auto" w:fill="auto"/>
             <w:vAlign w:val="center"/>
           </w:tcPr>
@@ -3705,7 +3829,7 @@
         </w:tc>
         <w:tc>
           <w:tcPr>
-            <w:tcW w:w="3630" w:type="dxa"/>
+            <w:tcW w:w="3827" w:type="dxa"/>
             <w:shd w:val="clear" w:color="auto" w:fill="auto"/>
             <w:vAlign w:val="center"/>
           </w:tcPr>
@@ -3738,7 +3862,7 @@
                           </pic:cNvPicPr>
                         </pic:nvPicPr>
                         <pic:blipFill>
-                          <a:blip r:embed="rId18" cstate="print">
+                          <a:blip r:embed="rId21" cstate="print">
                             <a:extLst>
                               <a:ext uri="{28A0092B-C50C-407E-A947-70E740481C1C}">
                                 <a14:useLocalDpi xmlns:a14="http://schemas.microsoft.com/office/drawing/2010/main" val="0"/>
@@ -3773,8 +3897,8 @@
         </w:tc>
         <w:tc>
           <w:tcPr>
-            <w:tcW w:w="1200" w:type="dxa"/>
-            <w:shd w:val="clear" w:color="auto" w:fill="auto"/>
+            <w:tcW w:w="709" w:type="dxa"/>
+            <w:shd w:val="clear" w:color="auto" w:fill="E2EFD9" w:themeFill="accent6" w:themeFillTint="33"/>
             <w:vAlign w:val="center"/>
           </w:tcPr>
           <w:p>
@@ -3793,7 +3917,7 @@
         </w:tc>
         <w:tc>
           <w:tcPr>
-            <w:tcW w:w="1725" w:type="dxa"/>
+            <w:tcW w:w="1559" w:type="dxa"/>
             <w:shd w:val="clear" w:color="auto" w:fill="auto"/>
             <w:vAlign w:val="center"/>
           </w:tcPr>
@@ -3813,7 +3937,7 @@
         </w:tc>
         <w:tc>
           <w:tcPr>
-            <w:tcW w:w="1590" w:type="dxa"/>
+            <w:tcW w:w="1250" w:type="dxa"/>
             <w:shd w:val="clear" w:color="auto" w:fill="auto"/>
             <w:vAlign w:val="center"/>
           </w:tcPr>
@@ -3854,6 +3978,56 @@
     </w:sectPr>
   </w:body>
 </w:document>
+</file>
+
+<file path=word/endnotes.xml><?xml version="1.0" encoding="utf-8"?>
+<w:endnotes xmlns:wpc="http://schemas.microsoft.com/office/word/2010/wordprocessingCanvas" xmlns:cx="http://schemas.microsoft.com/office/drawing/2014/chartex" xmlns:cx1="http://schemas.microsoft.com/office/drawing/2015/9/8/chartex" xmlns:cx2="http://schemas.microsoft.com/office/drawing/2015/10/21/chartex" xmlns:cx3="http://schemas.microsoft.com/office/drawing/2016/5/9/chartex" xmlns:cx4="http://schemas.microsoft.com/office/drawing/2016/5/10/chartex" xmlns:cx5="http://schemas.microsoft.com/office/drawing/2016/5/11/chartex" xmlns:cx6="http://schemas.microsoft.com/office/drawing/2016/5/12/chartex" xmlns:cx7="http://schemas.microsoft.com/office/drawing/2016/5/13/chartex" xmlns:cx8="http://schemas.microsoft.com/office/drawing/2016/5/14/chartex" xmlns:mc="http://schemas.openxmlformats.org/markup-compatibility/2006" xmlns:aink="http://schemas.microsoft.com/office/drawing/2016/ink" xmlns:am3d="http://schemas.microsoft.com/office/drawing/2017/model3d" xmlns:o="urn:schemas-microsoft-com:office:office" xmlns:oel="http://schemas.microsoft.com/office/2019/extlst" xmlns:r="http://schemas.openxmlformats.org/officeDocument/2006/relationships" xmlns:m="http://schemas.openxmlformats.org/officeDocument/2006/math" xmlns:v="urn:schemas-microsoft-com:vml" xmlns:wp14="http://schemas.microsoft.com/office/word/2010/wordprocessingDrawing" xmlns:wp="http://schemas.openxmlformats.org/drawingml/2006/wordprocessingDrawing" xmlns:w10="urn:schemas-microsoft-com:office:word" xmlns:w="http://schemas.openxmlformats.org/wordprocessingml/2006/main" xmlns:w14="http://schemas.microsoft.com/office/word/2010/wordml" xmlns:w15="http://schemas.microsoft.com/office/word/2012/wordml" xmlns:w16cex="http://schemas.microsoft.com/office/word/2018/wordml/cex" xmlns:w16cid="http://schemas.microsoft.com/office/word/2016/wordml/cid" xmlns:w16="http://schemas.microsoft.com/office/word/2018/wordml" xmlns:w16du="http://schemas.microsoft.com/office/word/2023/wordml/word16du" xmlns:w16sdtdh="http://schemas.microsoft.com/office/word/2020/wordml/sdtdatahash" xmlns:w16sdtfl="http://schemas.microsoft.com/office/word/2024/wordml/sdtformatlock" xmlns:w16se="http://schemas.microsoft.com/office/word/2015/wordml/symex" xmlns:wpg="http://schemas.microsoft.com/office/word/2010/wordprocessingGroup" xmlns:wpi="http://schemas.microsoft.com/office/word/2010/wordprocessingInk" xmlns:wne="http://schemas.microsoft.com/office/word/2006/wordml" xmlns:wps="http://schemas.microsoft.com/office/word/2010/wordprocessingShape" mc:Ignorable="w14 w15 w16se w16cid w16 w16cex w16sdtdh w16sdtfl w16du wp14">
+  <w:endnote w:type="separator" w:id="-1">
+    <w:p>
+      <w:pPr>
+        <w:spacing w:after="0" w:line="240" w:lineRule="auto"/>
+      </w:pPr>
+      <w:r>
+        <w:separator/>
+      </w:r>
+    </w:p>
+  </w:endnote>
+  <w:endnote w:type="continuationSeparator" w:id="0">
+    <w:p>
+      <w:pPr>
+        <w:spacing w:after="0" w:line="240" w:lineRule="auto"/>
+      </w:pPr>
+      <w:r>
+        <w:continuationSeparator/>
+      </w:r>
+    </w:p>
+  </w:endnote>
+</w:endnotes>
+</file>
+
+<file path=word/footnotes.xml><?xml version="1.0" encoding="utf-8"?>
+<w:footnotes xmlns:wpc="http://schemas.microsoft.com/office/word/2010/wordprocessingCanvas" xmlns:cx="http://schemas.microsoft.com/office/drawing/2014/chartex" xmlns:cx1="http://schemas.microsoft.com/office/drawing/2015/9/8/chartex" xmlns:cx2="http://schemas.microsoft.com/office/drawing/2015/10/21/chartex" xmlns:cx3="http://schemas.microsoft.com/office/drawing/2016/5/9/chartex" xmlns:cx4="http://schemas.microsoft.com/office/drawing/2016/5/10/chartex" xmlns:cx5="http://schemas.microsoft.com/office/drawing/2016/5/11/chartex" xmlns:cx6="http://schemas.microsoft.com/office/drawing/2016/5/12/chartex" xmlns:cx7="http://schemas.microsoft.com/office/drawing/2016/5/13/chartex" xmlns:cx8="http://schemas.microsoft.com/office/drawing/2016/5/14/chartex" xmlns:mc="http://schemas.openxmlformats.org/markup-compatibility/2006" xmlns:aink="http://schemas.microsoft.com/office/drawing/2016/ink" xmlns:am3d="http://schemas.microsoft.com/office/drawing/2017/model3d" xmlns:o="urn:schemas-microsoft-com:office:office" xmlns:oel="http://schemas.microsoft.com/office/2019/extlst" xmlns:r="http://schemas.openxmlformats.org/officeDocument/2006/relationships" xmlns:m="http://schemas.openxmlformats.org/officeDocument/2006/math" xmlns:v="urn:schemas-microsoft-com:vml" xmlns:wp14="http://schemas.microsoft.com/office/word/2010/wordprocessingDrawing" xmlns:wp="http://schemas.openxmlformats.org/drawingml/2006/wordprocessingDrawing" xmlns:w10="urn:schemas-microsoft-com:office:word" xmlns:w="http://schemas.openxmlformats.org/wordprocessingml/2006/main" xmlns:w14="http://schemas.microsoft.com/office/word/2010/wordml" xmlns:w15="http://schemas.microsoft.com/office/word/2012/wordml" xmlns:w16cex="http://schemas.microsoft.com/office/word/2018/wordml/cex" xmlns:w16cid="http://schemas.microsoft.com/office/word/2016/wordml/cid" xmlns:w16="http://schemas.microsoft.com/office/word/2018/wordml" xmlns:w16du="http://schemas.microsoft.com/office/word/2023/wordml/word16du" xmlns:w16sdtdh="http://schemas.microsoft.com/office/word/2020/wordml/sdtdatahash" xmlns:w16sdtfl="http://schemas.microsoft.com/office/word/2024/wordml/sdtformatlock" xmlns:w16se="http://schemas.microsoft.com/office/word/2015/wordml/symex" xmlns:wpg="http://schemas.microsoft.com/office/word/2010/wordprocessingGroup" xmlns:wpi="http://schemas.microsoft.com/office/word/2010/wordprocessingInk" xmlns:wne="http://schemas.microsoft.com/office/word/2006/wordml" xmlns:wps="http://schemas.microsoft.com/office/word/2010/wordprocessingShape" mc:Ignorable="w14 w15 w16se w16cid w16 w16cex w16sdtdh w16sdtfl w16du wp14">
+  <w:footnote w:type="separator" w:id="-1">
+    <w:p>
+      <w:pPr>
+        <w:spacing w:after="0" w:line="240" w:lineRule="auto"/>
+      </w:pPr>
+      <w:r>
+        <w:separator/>
+      </w:r>
+    </w:p>
+  </w:footnote>
+  <w:footnote w:type="continuationSeparator" w:id="0">
+    <w:p>
+      <w:pPr>
+        <w:spacing w:after="0" w:line="240" w:lineRule="auto"/>
+      </w:pPr>
+      <w:r>
+        <w:continuationSeparator/>
+      </w:r>
+    </w:p>
+  </w:footnote>
+</w:footnotes>
 </file>
 
 <file path=word/styles.xml><?xml version="1.0" encoding="utf-8"?>

</xml_diff>